<commit_message>
Adicionando campo obrigatório de Nº de Processo, salvamento dinâmico da empresa e injeção no template Word da Ordem de Serviço
</commit_message>
<xml_diff>
--- a/dados/modelo_etufor_mcmensagem_pp.docx
+++ b/dados/modelo_etufor_mcmensagem_pp.docx
@@ -35,10 +35,10 @@
               <wp:anchor distT="0" distB="0" distL="114300" distR="114300" simplePos="0" relativeHeight="251672576" behindDoc="0" locked="0" layoutInCell="1" allowOverlap="1" wp14:anchorId="68C91675" wp14:editId="056F7E78">
                 <wp:simplePos x="0" y="0"/>
                 <wp:positionH relativeFrom="column">
-                  <wp:posOffset>2933700</wp:posOffset>
+                  <wp:posOffset>2943225</wp:posOffset>
                 </wp:positionH>
                 <wp:positionV relativeFrom="paragraph">
-                  <wp:posOffset>441325</wp:posOffset>
+                  <wp:posOffset>555625</wp:posOffset>
                 </wp:positionV>
                 <wp:extent cx="3181350" cy="1085850"/>
                 <wp:effectExtent l="19050" t="19050" r="19050" b="19050"/>
@@ -122,7 +122,7 @@
                 <v:stroke joinstyle="miter"/>
                 <v:path gradientshapeok="t" o:connecttype="rect"/>
               </v:shapetype>
-              <v:shape id="Caixa de Texto 2" o:spid="_x0000_s1026" type="#_x0000_t202" style="position:absolute;margin-left:231pt;margin-top:34.75pt;width:250.5pt;height:85.5pt;z-index:251672576;visibility:visible;mso-wrap-style:square;mso-width-percent:0;mso-height-percent:0;mso-wrap-distance-left:9pt;mso-wrap-distance-top:0;mso-wrap-distance-right:9pt;mso-wrap-distance-bottom:0;mso-position-horizontal:absolute;mso-position-horizontal-relative:text;mso-position-vertical:absolute;mso-position-vertical-relative:text;mso-width-percent:0;mso-height-percent:0;mso-width-relative:margin;mso-height-relative:margin;v-text-anchor:top" o:gfxdata="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" filled="f" strokeweight="3pt">
+              <v:shape id="Caixa de Texto 2" o:spid="_x0000_s1026" type="#_x0000_t202" style="position:absolute;margin-left:231.75pt;margin-top:43.75pt;width:250.5pt;height:85.5pt;z-index:251672576;visibility:visible;mso-wrap-style:square;mso-width-percent:0;mso-height-percent:0;mso-wrap-distance-left:9pt;mso-wrap-distance-top:0;mso-wrap-distance-right:9pt;mso-wrap-distance-bottom:0;mso-position-horizontal:absolute;mso-position-horizontal-relative:text;mso-position-vertical:absolute;mso-position-vertical-relative:text;mso-width-percent:0;mso-height-percent:0;mso-width-relative:margin;mso-height-relative:margin;v-text-anchor:top" o:gfxdata="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" filled="f" strokeweight="3pt">
                 <v:textbox>
                   <w:txbxContent>
                     <w:p>
@@ -298,55 +298,55 @@
         <w:ind w:left="4320" w:firstLine="720"/>
         <w:rPr>
           <w:b/>
-          <w:sz w:val="28"/>
-          <w:szCs w:val="28"/>
+          <w:sz w:val="26"/>
+          <w:szCs w:val="26"/>
         </w:rPr>
       </w:pPr>
       <w:r>
         <w:rPr>
           <w:b/>
-          <w:sz w:val="28"/>
-          <w:szCs w:val="28"/>
+          <w:sz w:val="26"/>
+          <w:szCs w:val="26"/>
         </w:rPr>
         <w:t>N°</w:t>
       </w:r>
       <w:r>
         <w:rPr>
           <w:b/>
-          <w:sz w:val="28"/>
-          <w:szCs w:val="28"/>
+          <w:sz w:val="26"/>
+          <w:szCs w:val="26"/>
         </w:rPr>
         <w:t>: {{</w:t>
       </w:r>
       <w:r>
         <w:rPr>
           <w:b/>
-          <w:sz w:val="28"/>
-          <w:szCs w:val="28"/>
+          <w:sz w:val="26"/>
+          <w:szCs w:val="26"/>
         </w:rPr>
         <w:t>NUMERO_OS</w:t>
       </w:r>
       <w:r>
         <w:rPr>
           <w:b/>
-          <w:sz w:val="28"/>
-          <w:szCs w:val="28"/>
+          <w:sz w:val="26"/>
+          <w:szCs w:val="26"/>
         </w:rPr>
         <w:t>}}</w:t>
       </w:r>
       <w:r>
         <w:rPr>
           <w:b/>
-          <w:sz w:val="28"/>
-          <w:szCs w:val="28"/>
+          <w:sz w:val="26"/>
+          <w:szCs w:val="26"/>
         </w:rPr>
         <w:t xml:space="preserve"> </w:t>
       </w:r>
       <w:r>
         <w:rPr>
           <w:b/>
-          <w:sz w:val="28"/>
-          <w:szCs w:val="28"/>
+          <w:sz w:val="26"/>
+          <w:szCs w:val="26"/>
         </w:rPr>
         <w:t>/ 2026</w:t>
       </w:r>
@@ -354,12 +354,34 @@
     <w:p>
       <w:pPr>
         <w:ind w:left="4320" w:firstLine="720"/>
+        <w:rPr>
+          <w:b/>
+          <w:sz w:val="26"/>
+          <w:szCs w:val="26"/>
+        </w:rPr>
       </w:pPr>
       <w:r>
         <w:rPr>
           <w:b/>
-          <w:sz w:val="28"/>
-          <w:szCs w:val="28"/>
+          <w:sz w:val="26"/>
+          <w:szCs w:val="26"/>
+        </w:rPr>
+        <w:t>N° PROCESSO: {{PROCESSO}}</w:t>
+      </w:r>
+    </w:p>
+    <w:p>
+      <w:pPr>
+        <w:ind w:left="4320" w:firstLine="720"/>
+        <w:rPr>
+          <w:sz w:val="26"/>
+          <w:szCs w:val="26"/>
+        </w:rPr>
+      </w:pPr>
+      <w:r>
+        <w:rPr>
+          <w:b/>
+          <w:sz w:val="26"/>
+          <w:szCs w:val="26"/>
         </w:rPr>
         <w:t>DATA: {{DATA}}</w:t>
       </w:r>
@@ -386,7 +408,7 @@
                   <wp:posOffset>2914650</wp:posOffset>
                 </wp:positionH>
                 <wp:positionV relativeFrom="paragraph">
-                  <wp:posOffset>442595</wp:posOffset>
+                  <wp:posOffset>433070</wp:posOffset>
                 </wp:positionV>
                 <wp:extent cx="3209925" cy="1685925"/>
                 <wp:effectExtent l="19050" t="19050" r="28575" b="28575"/>
@@ -731,11 +753,7 @@
           </mc:Choice>
           <mc:Fallback>
             <w:pict>
-              <v:shapetype w14:anchorId="71C373C7" id="_x0000_t202" coordsize="21600,21600" o:spt="202" path="m,l,21600r21600,l21600,xe">
-                <v:stroke joinstyle="miter"/>
-                <v:path gradientshapeok="t" o:connecttype="rect"/>
-              </v:shapetype>
-              <v:shape id="Caixa de texto 16" o:spid="_x0000_s1027" type="#_x0000_t202" style="position:absolute;margin-left:229.5pt;margin-top:34.85pt;width:252.75pt;height:132.75pt;z-index:251670528;visibility:visible;mso-wrap-style:square;mso-width-percent:0;mso-height-percent:0;mso-wrap-distance-left:9pt;mso-wrap-distance-top:0;mso-wrap-distance-right:9pt;mso-wrap-distance-bottom:0;mso-position-horizontal:absolute;mso-position-horizontal-relative:text;mso-position-vertical:absolute;mso-position-vertical-relative:text;mso-width-percent:0;mso-height-percent:0;mso-width-relative:margin;mso-height-relative:margin;v-text-anchor:top" o:gfxdata="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" filled="f" strokeweight="3pt">
+              <v:shape w14:anchorId="71C373C7" id="Caixa de texto 16" o:spid="_x0000_s1027" type="#_x0000_t202" style="position:absolute;margin-left:229.5pt;margin-top:34.1pt;width:252.75pt;height:132.75pt;z-index:251670528;visibility:visible;mso-wrap-style:square;mso-width-percent:0;mso-height-percent:0;mso-wrap-distance-left:9pt;mso-wrap-distance-top:0;mso-wrap-distance-right:9pt;mso-wrap-distance-bottom:0;mso-position-horizontal:absolute;mso-position-horizontal-relative:text;mso-position-vertical:absolute;mso-position-vertical-relative:text;mso-width-percent:0;mso-height-percent:0;mso-width-relative:margin;mso-height-relative:margin;v-text-anchor:top" o:gfxdata="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" filled="f" strokeweight="3pt">
                 <v:textbox>
                   <w:txbxContent>
                     <w:tbl>
@@ -1899,7 +1917,7 @@
 
 <file path=word/numbering.xml><?xml version="1.0" encoding="utf-8"?>
 <w:numbering xmlns:wpc="http://schemas.microsoft.com/office/word/2010/wordprocessingCanvas" xmlns:mc="http://schemas.openxmlformats.org/markup-compatibility/2006" xmlns:o="urn:schemas-microsoft-com:office:office" xmlns:r="http://schemas.openxmlformats.org/officeDocument/2006/relationships" xmlns:m="http://schemas.openxmlformats.org/officeDocument/2006/math" xmlns:v="urn:schemas-microsoft-com:vml" xmlns:wp14="http://schemas.microsoft.com/office/word/2010/wordprocessingDrawing" xmlns:wp="http://schemas.openxmlformats.org/drawingml/2006/wordprocessingDrawing" xmlns:w10="urn:schemas-microsoft-com:office:word" xmlns:w="http://schemas.openxmlformats.org/wordprocessingml/2006/main" xmlns:w14="http://schemas.microsoft.com/office/word/2010/wordml" xmlns:w15="http://schemas.microsoft.com/office/word/2012/wordml" xmlns:wpg="http://schemas.microsoft.com/office/word/2010/wordprocessingGroup" xmlns:wpi="http://schemas.microsoft.com/office/word/2010/wordprocessingInk" xmlns:wne="http://schemas.microsoft.com/office/word/2006/wordml" xmlns:wps="http://schemas.microsoft.com/office/word/2010/wordprocessingShape" mc:Ignorable="w14 w15 wp14">
-  <w:abstractNum w:abstractNumId="0">
+  <w:abstractNum w:abstractNumId="0" w15:restartNumberingAfterBreak="0">
     <w:nsid w:val="73F3077A"/>
     <w:multiLevelType w:val="multilevel"/>
     <w:tmpl w:val="027824B8"/>
@@ -2537,7 +2555,6 @@
       <w:spacing w:line="240" w:lineRule="auto"/>
     </w:pPr>
     <w:tblPr>
-      <w:tblInd w:w="0" w:type="dxa"/>
       <w:tblBorders>
         <w:top w:val="single" w:sz="4" w:space="0" w:color="000000"/>
         <w:left w:val="single" w:sz="4" w:space="0" w:color="000000"/>
@@ -2546,12 +2563,6 @@
         <w:insideH w:val="single" w:sz="4" w:space="0" w:color="000000"/>
         <w:insideV w:val="single" w:sz="4" w:space="0" w:color="000000"/>
       </w:tblBorders>
-      <w:tblCellMar>
-        <w:top w:w="0" w:type="dxa"/>
-        <w:left w:w="108" w:type="dxa"/>
-        <w:bottom w:w="0" w:type="dxa"/>
-        <w:right w:w="108" w:type="dxa"/>
-      </w:tblCellMar>
     </w:tblPr>
   </w:style>
   <w:style w:type="table" w:customStyle="1" w:styleId="TableGridLight">
@@ -2562,7 +2573,6 @@
       <w:spacing w:line="240" w:lineRule="auto"/>
     </w:pPr>
     <w:tblPr>
-      <w:tblInd w:w="0" w:type="dxa"/>
       <w:tblBorders>
         <w:top w:val="single" w:sz="4" w:space="0" w:color="AFAFAF" w:themeColor="text1" w:themeTint="50"/>
         <w:left w:val="single" w:sz="4" w:space="0" w:color="AFAFAF" w:themeColor="text1" w:themeTint="50"/>
@@ -2571,12 +2581,6 @@
         <w:insideH w:val="single" w:sz="4" w:space="0" w:color="AFAFAF" w:themeColor="text1" w:themeTint="50"/>
         <w:insideV w:val="single" w:sz="4" w:space="0" w:color="AFAFAF" w:themeColor="text1" w:themeTint="50"/>
       </w:tblBorders>
-      <w:tblCellMar>
-        <w:top w:w="0" w:type="dxa"/>
-        <w:left w:w="108" w:type="dxa"/>
-        <w:bottom w:w="0" w:type="dxa"/>
-        <w:right w:w="108" w:type="dxa"/>
-      </w:tblCellMar>
     </w:tblPr>
   </w:style>
   <w:style w:type="table" w:styleId="TabelaSimples1">
@@ -2587,7 +2591,6 @@
       <w:spacing w:line="240" w:lineRule="auto"/>
     </w:pPr>
     <w:tblPr>
-      <w:tblInd w:w="0" w:type="dxa"/>
       <w:tblBorders>
         <w:top w:val="single" w:sz="4" w:space="0" w:color="AFAFAF" w:themeColor="text1" w:themeTint="50"/>
         <w:left w:val="single" w:sz="4" w:space="0" w:color="AFAFAF" w:themeColor="text1" w:themeTint="50"/>
@@ -2596,12 +2599,6 @@
         <w:insideH w:val="single" w:sz="4" w:space="0" w:color="AFAFAF" w:themeColor="text1" w:themeTint="50"/>
         <w:insideV w:val="single" w:sz="4" w:space="0" w:color="AFAFAF" w:themeColor="text1" w:themeTint="50"/>
       </w:tblBorders>
-      <w:tblCellMar>
-        <w:top w:w="0" w:type="dxa"/>
-        <w:left w:w="108" w:type="dxa"/>
-        <w:bottom w:w="0" w:type="dxa"/>
-        <w:right w:w="108" w:type="dxa"/>
-      </w:tblCellMar>
     </w:tblPr>
     <w:tblStylePr w:type="firstRow">
       <w:rPr>
@@ -2656,19 +2653,12 @@
       <w:spacing w:line="240" w:lineRule="auto"/>
     </w:pPr>
     <w:tblPr>
-      <w:tblInd w:w="0" w:type="dxa"/>
       <w:tblBorders>
         <w:top w:val="single" w:sz="4" w:space="0" w:color="000000" w:themeColor="text1"/>
         <w:left w:val="none" w:sz="4" w:space="0" w:color="000000" w:themeColor="text1"/>
         <w:bottom w:val="single" w:sz="4" w:space="0" w:color="000000" w:themeColor="text1"/>
         <w:right w:val="none" w:sz="4" w:space="0" w:color="000000" w:themeColor="text1"/>
       </w:tblBorders>
-      <w:tblCellMar>
-        <w:top w:w="0" w:type="dxa"/>
-        <w:left w:w="108" w:type="dxa"/>
-        <w:bottom w:w="0" w:type="dxa"/>
-        <w:right w:w="108" w:type="dxa"/>
-      </w:tblCellMar>
     </w:tblPr>
     <w:tblStylePr w:type="firstRow">
       <w:rPr>
@@ -2747,13 +2737,6 @@
     <w:tblPr>
       <w:tblStyleRowBandSize w:val="1"/>
       <w:tblStyleColBandSize w:val="1"/>
-      <w:tblInd w:w="0" w:type="dxa"/>
-      <w:tblCellMar>
-        <w:top w:w="0" w:type="dxa"/>
-        <w:left w:w="108" w:type="dxa"/>
-        <w:bottom w:w="0" w:type="dxa"/>
-        <w:right w:w="108" w:type="dxa"/>
-      </w:tblCellMar>
     </w:tblPr>
     <w:tblStylePr w:type="firstRow">
       <w:rPr>
@@ -2834,13 +2817,6 @@
     <w:tblPr>
       <w:tblStyleRowBandSize w:val="1"/>
       <w:tblStyleColBandSize w:val="1"/>
-      <w:tblInd w:w="0" w:type="dxa"/>
-      <w:tblCellMar>
-        <w:top w:w="0" w:type="dxa"/>
-        <w:left w:w="108" w:type="dxa"/>
-        <w:bottom w:w="0" w:type="dxa"/>
-        <w:right w:w="108" w:type="dxa"/>
-      </w:tblCellMar>
     </w:tblPr>
     <w:tblStylePr w:type="firstRow">
       <w:rPr>
@@ -2899,13 +2875,6 @@
     <w:tblPr>
       <w:tblStyleRowBandSize w:val="1"/>
       <w:tblStyleColBandSize w:val="1"/>
-      <w:tblInd w:w="0" w:type="dxa"/>
-      <w:tblCellMar>
-        <w:top w:w="0" w:type="dxa"/>
-        <w:left w:w="108" w:type="dxa"/>
-        <w:bottom w:w="0" w:type="dxa"/>
-        <w:right w:w="108" w:type="dxa"/>
-      </w:tblCellMar>
     </w:tblPr>
     <w:tblStylePr w:type="firstRow">
       <w:rPr>
@@ -2999,7 +2968,6 @@
     <w:tblPr>
       <w:tblStyleRowBandSize w:val="1"/>
       <w:tblStyleColBandSize w:val="1"/>
-      <w:tblInd w:w="0" w:type="dxa"/>
       <w:tblBorders>
         <w:top w:val="single" w:sz="4" w:space="0" w:color="989898" w:themeColor="text1" w:themeTint="67"/>
         <w:left w:val="single" w:sz="4" w:space="0" w:color="989898" w:themeColor="text1" w:themeTint="67"/>
@@ -3008,12 +2976,6 @@
         <w:insideH w:val="single" w:sz="4" w:space="0" w:color="989898" w:themeColor="text1" w:themeTint="67"/>
         <w:insideV w:val="single" w:sz="4" w:space="0" w:color="989898" w:themeColor="text1" w:themeTint="67"/>
       </w:tblBorders>
-      <w:tblCellMar>
-        <w:top w:w="0" w:type="dxa"/>
-        <w:left w:w="108" w:type="dxa"/>
-        <w:bottom w:w="0" w:type="dxa"/>
-        <w:right w:w="108" w:type="dxa"/>
-      </w:tblCellMar>
     </w:tblPr>
     <w:tblStylePr w:type="firstRow">
       <w:rPr>
@@ -3072,7 +3034,6 @@
     <w:tblPr>
       <w:tblStyleRowBandSize w:val="1"/>
       <w:tblStyleColBandSize w:val="1"/>
-      <w:tblInd w:w="0" w:type="dxa"/>
       <w:tblBorders>
         <w:top w:val="single" w:sz="4" w:space="0" w:color="B7CBE4" w:themeColor="accent1" w:themeTint="67"/>
         <w:left w:val="single" w:sz="4" w:space="0" w:color="B7CBE4" w:themeColor="accent1" w:themeTint="67"/>
@@ -3081,12 +3042,6 @@
         <w:insideH w:val="single" w:sz="4" w:space="0" w:color="B7CBE4" w:themeColor="accent1" w:themeTint="67"/>
         <w:insideV w:val="single" w:sz="4" w:space="0" w:color="B7CBE4" w:themeColor="accent1" w:themeTint="67"/>
       </w:tblBorders>
-      <w:tblCellMar>
-        <w:top w:w="0" w:type="dxa"/>
-        <w:left w:w="108" w:type="dxa"/>
-        <w:bottom w:w="0" w:type="dxa"/>
-        <w:right w:w="108" w:type="dxa"/>
-      </w:tblCellMar>
     </w:tblPr>
     <w:tblStylePr w:type="firstRow">
       <w:rPr>
@@ -3145,7 +3100,6 @@
     <w:tblPr>
       <w:tblStyleRowBandSize w:val="1"/>
       <w:tblStyleColBandSize w:val="1"/>
-      <w:tblInd w:w="0" w:type="dxa"/>
       <w:tblBorders>
         <w:top w:val="single" w:sz="4" w:space="0" w:color="E5B7B6" w:themeColor="accent2" w:themeTint="67"/>
         <w:left w:val="single" w:sz="4" w:space="0" w:color="E5B7B6" w:themeColor="accent2" w:themeTint="67"/>
@@ -3154,12 +3108,6 @@
         <w:insideH w:val="single" w:sz="4" w:space="0" w:color="E5B7B6" w:themeColor="accent2" w:themeTint="67"/>
         <w:insideV w:val="single" w:sz="4" w:space="0" w:color="E5B7B6" w:themeColor="accent2" w:themeTint="67"/>
       </w:tblBorders>
-      <w:tblCellMar>
-        <w:top w:w="0" w:type="dxa"/>
-        <w:left w:w="108" w:type="dxa"/>
-        <w:bottom w:w="0" w:type="dxa"/>
-        <w:right w:w="108" w:type="dxa"/>
-      </w:tblCellMar>
     </w:tblPr>
     <w:tblStylePr w:type="firstRow">
       <w:rPr>
@@ -3218,7 +3166,6 @@
     <w:tblPr>
       <w:tblStyleRowBandSize w:val="1"/>
       <w:tblStyleColBandSize w:val="1"/>
-      <w:tblInd w:w="0" w:type="dxa"/>
       <w:tblBorders>
         <w:top w:val="single" w:sz="4" w:space="0" w:color="D6E3BB" w:themeColor="accent3" w:themeTint="67"/>
         <w:left w:val="single" w:sz="4" w:space="0" w:color="D6E3BB" w:themeColor="accent3" w:themeTint="67"/>
@@ -3227,12 +3174,6 @@
         <w:insideH w:val="single" w:sz="4" w:space="0" w:color="D6E3BB" w:themeColor="accent3" w:themeTint="67"/>
         <w:insideV w:val="single" w:sz="4" w:space="0" w:color="D6E3BB" w:themeColor="accent3" w:themeTint="67"/>
       </w:tblBorders>
-      <w:tblCellMar>
-        <w:top w:w="0" w:type="dxa"/>
-        <w:left w:w="108" w:type="dxa"/>
-        <w:bottom w:w="0" w:type="dxa"/>
-        <w:right w:w="108" w:type="dxa"/>
-      </w:tblCellMar>
     </w:tblPr>
     <w:tblStylePr w:type="firstRow">
       <w:rPr>
@@ -3291,7 +3232,6 @@
     <w:tblPr>
       <w:tblStyleRowBandSize w:val="1"/>
       <w:tblStyleColBandSize w:val="1"/>
-      <w:tblInd w:w="0" w:type="dxa"/>
       <w:tblBorders>
         <w:top w:val="single" w:sz="4" w:space="0" w:color="CBC0D9" w:themeColor="accent4" w:themeTint="67"/>
         <w:left w:val="single" w:sz="4" w:space="0" w:color="CBC0D9" w:themeColor="accent4" w:themeTint="67"/>
@@ -3300,12 +3240,6 @@
         <w:insideH w:val="single" w:sz="4" w:space="0" w:color="CBC0D9" w:themeColor="accent4" w:themeTint="67"/>
         <w:insideV w:val="single" w:sz="4" w:space="0" w:color="CBC0D9" w:themeColor="accent4" w:themeTint="67"/>
       </w:tblBorders>
-      <w:tblCellMar>
-        <w:top w:w="0" w:type="dxa"/>
-        <w:left w:w="108" w:type="dxa"/>
-        <w:bottom w:w="0" w:type="dxa"/>
-        <w:right w:w="108" w:type="dxa"/>
-      </w:tblCellMar>
     </w:tblPr>
     <w:tblStylePr w:type="firstRow">
       <w:rPr>
@@ -3364,7 +3298,6 @@
     <w:tblPr>
       <w:tblStyleRowBandSize w:val="1"/>
       <w:tblStyleColBandSize w:val="1"/>
-      <w:tblInd w:w="0" w:type="dxa"/>
       <w:tblBorders>
         <w:top w:val="single" w:sz="4" w:space="0" w:color="B6DDE8" w:themeColor="accent5" w:themeTint="67"/>
         <w:left w:val="single" w:sz="4" w:space="0" w:color="B6DDE8" w:themeColor="accent5" w:themeTint="67"/>
@@ -3373,12 +3306,6 @@
         <w:insideH w:val="single" w:sz="4" w:space="0" w:color="B6DDE8" w:themeColor="accent5" w:themeTint="67"/>
         <w:insideV w:val="single" w:sz="4" w:space="0" w:color="B6DDE8" w:themeColor="accent5" w:themeTint="67"/>
       </w:tblBorders>
-      <w:tblCellMar>
-        <w:top w:w="0" w:type="dxa"/>
-        <w:left w:w="108" w:type="dxa"/>
-        <w:bottom w:w="0" w:type="dxa"/>
-        <w:right w:w="108" w:type="dxa"/>
-      </w:tblCellMar>
     </w:tblPr>
     <w:tblStylePr w:type="firstRow">
       <w:rPr>
@@ -3437,7 +3364,6 @@
     <w:tblPr>
       <w:tblStyleRowBandSize w:val="1"/>
       <w:tblStyleColBandSize w:val="1"/>
-      <w:tblInd w:w="0" w:type="dxa"/>
       <w:tblBorders>
         <w:top w:val="single" w:sz="4" w:space="0" w:color="FBD4B4" w:themeColor="accent6" w:themeTint="67"/>
         <w:left w:val="single" w:sz="4" w:space="0" w:color="FBD4B4" w:themeColor="accent6" w:themeTint="67"/>
@@ -3446,12 +3372,6 @@
         <w:insideH w:val="single" w:sz="4" w:space="0" w:color="FBD4B4" w:themeColor="accent6" w:themeTint="67"/>
         <w:insideV w:val="single" w:sz="4" w:space="0" w:color="FBD4B4" w:themeColor="accent6" w:themeTint="67"/>
       </w:tblBorders>
-      <w:tblCellMar>
-        <w:top w:w="0" w:type="dxa"/>
-        <w:left w:w="108" w:type="dxa"/>
-        <w:bottom w:w="0" w:type="dxa"/>
-        <w:right w:w="108" w:type="dxa"/>
-      </w:tblCellMar>
     </w:tblPr>
     <w:tblStylePr w:type="firstRow">
       <w:rPr>
@@ -3510,18 +3430,11 @@
     <w:tblPr>
       <w:tblStyleRowBandSize w:val="1"/>
       <w:tblStyleColBandSize w:val="1"/>
-      <w:tblInd w:w="0" w:type="dxa"/>
       <w:tblBorders>
         <w:bottom w:val="single" w:sz="4" w:space="0" w:color="6A6A6A" w:themeColor="text1" w:themeTint="95"/>
         <w:insideH w:val="single" w:sz="4" w:space="0" w:color="6A6A6A" w:themeColor="text1" w:themeTint="95"/>
         <w:insideV w:val="single" w:sz="4" w:space="0" w:color="6A6A6A" w:themeColor="text1" w:themeTint="95"/>
       </w:tblBorders>
-      <w:tblCellMar>
-        <w:top w:w="0" w:type="dxa"/>
-        <w:left w:w="108" w:type="dxa"/>
-        <w:bottom w:w="0" w:type="dxa"/>
-        <w:right w:w="108" w:type="dxa"/>
-      </w:tblCellMar>
     </w:tblPr>
     <w:tblStylePr w:type="firstRow">
       <w:rPr>
@@ -3600,18 +3513,11 @@
     <w:tblPr>
       <w:tblStyleRowBandSize w:val="1"/>
       <w:tblStyleColBandSize w:val="1"/>
-      <w:tblInd w:w="0" w:type="dxa"/>
       <w:tblBorders>
         <w:bottom w:val="single" w:sz="4" w:space="0" w:color="5D8AC2" w:themeColor="accent1" w:themeTint="EA"/>
         <w:insideH w:val="single" w:sz="4" w:space="0" w:color="5D8AC2" w:themeColor="accent1" w:themeTint="EA"/>
         <w:insideV w:val="single" w:sz="4" w:space="0" w:color="5D8AC2" w:themeColor="accent1" w:themeTint="EA"/>
       </w:tblBorders>
-      <w:tblCellMar>
-        <w:top w:w="0" w:type="dxa"/>
-        <w:left w:w="108" w:type="dxa"/>
-        <w:bottom w:w="0" w:type="dxa"/>
-        <w:right w:w="108" w:type="dxa"/>
-      </w:tblCellMar>
     </w:tblPr>
     <w:tblStylePr w:type="firstRow">
       <w:rPr>
@@ -3690,18 +3596,11 @@
     <w:tblPr>
       <w:tblStyleRowBandSize w:val="1"/>
       <w:tblStyleColBandSize w:val="1"/>
-      <w:tblInd w:w="0" w:type="dxa"/>
       <w:tblBorders>
         <w:bottom w:val="single" w:sz="4" w:space="0" w:color="D99695" w:themeColor="accent2" w:themeTint="97"/>
         <w:insideH w:val="single" w:sz="4" w:space="0" w:color="D99695" w:themeColor="accent2" w:themeTint="97"/>
         <w:insideV w:val="single" w:sz="4" w:space="0" w:color="D99695" w:themeColor="accent2" w:themeTint="97"/>
       </w:tblBorders>
-      <w:tblCellMar>
-        <w:top w:w="0" w:type="dxa"/>
-        <w:left w:w="108" w:type="dxa"/>
-        <w:bottom w:w="0" w:type="dxa"/>
-        <w:right w:w="108" w:type="dxa"/>
-      </w:tblCellMar>
     </w:tblPr>
     <w:tblStylePr w:type="firstRow">
       <w:rPr>
@@ -3780,18 +3679,11 @@
     <w:tblPr>
       <w:tblStyleRowBandSize w:val="1"/>
       <w:tblStyleColBandSize w:val="1"/>
-      <w:tblInd w:w="0" w:type="dxa"/>
       <w:tblBorders>
         <w:bottom w:val="single" w:sz="4" w:space="0" w:color="9ABB59" w:themeColor="accent3" w:themeTint="FE"/>
         <w:insideH w:val="single" w:sz="4" w:space="0" w:color="9ABB59" w:themeColor="accent3" w:themeTint="FE"/>
         <w:insideV w:val="single" w:sz="4" w:space="0" w:color="9ABB59" w:themeColor="accent3" w:themeTint="FE"/>
       </w:tblBorders>
-      <w:tblCellMar>
-        <w:top w:w="0" w:type="dxa"/>
-        <w:left w:w="108" w:type="dxa"/>
-        <w:bottom w:w="0" w:type="dxa"/>
-        <w:right w:w="108" w:type="dxa"/>
-      </w:tblCellMar>
     </w:tblPr>
     <w:tblStylePr w:type="firstRow">
       <w:rPr>
@@ -3870,18 +3762,11 @@
     <w:tblPr>
       <w:tblStyleRowBandSize w:val="1"/>
       <w:tblStyleColBandSize w:val="1"/>
-      <w:tblInd w:w="0" w:type="dxa"/>
       <w:tblBorders>
         <w:bottom w:val="single" w:sz="4" w:space="0" w:color="B2A1C6" w:themeColor="accent4" w:themeTint="9A"/>
         <w:insideH w:val="single" w:sz="4" w:space="0" w:color="B2A1C6" w:themeColor="accent4" w:themeTint="9A"/>
         <w:insideV w:val="single" w:sz="4" w:space="0" w:color="B2A1C6" w:themeColor="accent4" w:themeTint="9A"/>
       </w:tblBorders>
-      <w:tblCellMar>
-        <w:top w:w="0" w:type="dxa"/>
-        <w:left w:w="108" w:type="dxa"/>
-        <w:bottom w:w="0" w:type="dxa"/>
-        <w:right w:w="108" w:type="dxa"/>
-      </w:tblCellMar>
     </w:tblPr>
     <w:tblStylePr w:type="firstRow">
       <w:rPr>
@@ -3960,18 +3845,11 @@
     <w:tblPr>
       <w:tblStyleRowBandSize w:val="1"/>
       <w:tblStyleColBandSize w:val="1"/>
-      <w:tblInd w:w="0" w:type="dxa"/>
       <w:tblBorders>
         <w:bottom w:val="single" w:sz="4" w:space="0" w:color="4BACC6" w:themeColor="accent5"/>
         <w:insideH w:val="single" w:sz="4" w:space="0" w:color="4BACC6" w:themeColor="accent5"/>
         <w:insideV w:val="single" w:sz="4" w:space="0" w:color="4BACC6" w:themeColor="accent5"/>
       </w:tblBorders>
-      <w:tblCellMar>
-        <w:top w:w="0" w:type="dxa"/>
-        <w:left w:w="108" w:type="dxa"/>
-        <w:bottom w:w="0" w:type="dxa"/>
-        <w:right w:w="108" w:type="dxa"/>
-      </w:tblCellMar>
     </w:tblPr>
     <w:tblStylePr w:type="firstRow">
       <w:rPr>
@@ -4050,18 +3928,11 @@
     <w:tblPr>
       <w:tblStyleRowBandSize w:val="1"/>
       <w:tblStyleColBandSize w:val="1"/>
-      <w:tblInd w:w="0" w:type="dxa"/>
       <w:tblBorders>
         <w:bottom w:val="single" w:sz="4" w:space="0" w:color="F79646" w:themeColor="accent6"/>
         <w:insideH w:val="single" w:sz="4" w:space="0" w:color="F79646" w:themeColor="accent6"/>
         <w:insideV w:val="single" w:sz="4" w:space="0" w:color="F79646" w:themeColor="accent6"/>
       </w:tblBorders>
-      <w:tblCellMar>
-        <w:top w:w="0" w:type="dxa"/>
-        <w:left w:w="108" w:type="dxa"/>
-        <w:bottom w:w="0" w:type="dxa"/>
-        <w:right w:w="108" w:type="dxa"/>
-      </w:tblCellMar>
     </w:tblPr>
     <w:tblStylePr w:type="firstRow">
       <w:rPr>
@@ -4140,18 +4011,11 @@
     <w:tblPr>
       <w:tblStyleRowBandSize w:val="1"/>
       <w:tblStyleColBandSize w:val="1"/>
-      <w:tblInd w:w="0" w:type="dxa"/>
       <w:tblBorders>
         <w:bottom w:val="single" w:sz="4" w:space="0" w:color="6A6A6A" w:themeColor="text1" w:themeTint="95"/>
         <w:insideH w:val="single" w:sz="4" w:space="0" w:color="6A6A6A" w:themeColor="text1" w:themeTint="95"/>
         <w:insideV w:val="single" w:sz="4" w:space="0" w:color="6A6A6A" w:themeColor="text1" w:themeTint="95"/>
       </w:tblBorders>
-      <w:tblCellMar>
-        <w:top w:w="0" w:type="dxa"/>
-        <w:left w:w="108" w:type="dxa"/>
-        <w:bottom w:w="0" w:type="dxa"/>
-        <w:right w:w="108" w:type="dxa"/>
-      </w:tblCellMar>
     </w:tblPr>
     <w:tblStylePr w:type="firstRow">
       <w:rPr>
@@ -4253,18 +4117,11 @@
     <w:tblPr>
       <w:tblStyleRowBandSize w:val="1"/>
       <w:tblStyleColBandSize w:val="1"/>
-      <w:tblInd w:w="0" w:type="dxa"/>
       <w:tblBorders>
         <w:bottom w:val="single" w:sz="4" w:space="0" w:color="5D8AC2" w:themeColor="accent1" w:themeTint="EA"/>
         <w:insideH w:val="single" w:sz="4" w:space="0" w:color="5D8AC2" w:themeColor="accent1" w:themeTint="EA"/>
         <w:insideV w:val="single" w:sz="4" w:space="0" w:color="5D8AC2" w:themeColor="accent1" w:themeTint="EA"/>
       </w:tblBorders>
-      <w:tblCellMar>
-        <w:top w:w="0" w:type="dxa"/>
-        <w:left w:w="108" w:type="dxa"/>
-        <w:bottom w:w="0" w:type="dxa"/>
-        <w:right w:w="108" w:type="dxa"/>
-      </w:tblCellMar>
     </w:tblPr>
     <w:tblStylePr w:type="firstRow">
       <w:rPr>
@@ -4366,18 +4223,11 @@
     <w:tblPr>
       <w:tblStyleRowBandSize w:val="1"/>
       <w:tblStyleColBandSize w:val="1"/>
-      <w:tblInd w:w="0" w:type="dxa"/>
       <w:tblBorders>
         <w:bottom w:val="single" w:sz="4" w:space="0" w:color="D99695" w:themeColor="accent2" w:themeTint="97"/>
         <w:insideH w:val="single" w:sz="4" w:space="0" w:color="D99695" w:themeColor="accent2" w:themeTint="97"/>
         <w:insideV w:val="single" w:sz="4" w:space="0" w:color="D99695" w:themeColor="accent2" w:themeTint="97"/>
       </w:tblBorders>
-      <w:tblCellMar>
-        <w:top w:w="0" w:type="dxa"/>
-        <w:left w:w="108" w:type="dxa"/>
-        <w:bottom w:w="0" w:type="dxa"/>
-        <w:right w:w="108" w:type="dxa"/>
-      </w:tblCellMar>
     </w:tblPr>
     <w:tblStylePr w:type="firstRow">
       <w:rPr>
@@ -4479,18 +4329,11 @@
     <w:tblPr>
       <w:tblStyleRowBandSize w:val="1"/>
       <w:tblStyleColBandSize w:val="1"/>
-      <w:tblInd w:w="0" w:type="dxa"/>
       <w:tblBorders>
         <w:bottom w:val="single" w:sz="4" w:space="0" w:color="9ABB59" w:themeColor="accent3" w:themeTint="FE"/>
         <w:insideH w:val="single" w:sz="4" w:space="0" w:color="9ABB59" w:themeColor="accent3" w:themeTint="FE"/>
         <w:insideV w:val="single" w:sz="4" w:space="0" w:color="9ABB59" w:themeColor="accent3" w:themeTint="FE"/>
       </w:tblBorders>
-      <w:tblCellMar>
-        <w:top w:w="0" w:type="dxa"/>
-        <w:left w:w="108" w:type="dxa"/>
-        <w:bottom w:w="0" w:type="dxa"/>
-        <w:right w:w="108" w:type="dxa"/>
-      </w:tblCellMar>
     </w:tblPr>
     <w:tblStylePr w:type="firstRow">
       <w:rPr>
@@ -4592,18 +4435,11 @@
     <w:tblPr>
       <w:tblStyleRowBandSize w:val="1"/>
       <w:tblStyleColBandSize w:val="1"/>
-      <w:tblInd w:w="0" w:type="dxa"/>
       <w:tblBorders>
         <w:bottom w:val="single" w:sz="4" w:space="0" w:color="B2A1C6" w:themeColor="accent4" w:themeTint="9A"/>
         <w:insideH w:val="single" w:sz="4" w:space="0" w:color="B2A1C6" w:themeColor="accent4" w:themeTint="9A"/>
         <w:insideV w:val="single" w:sz="4" w:space="0" w:color="B2A1C6" w:themeColor="accent4" w:themeTint="9A"/>
       </w:tblBorders>
-      <w:tblCellMar>
-        <w:top w:w="0" w:type="dxa"/>
-        <w:left w:w="108" w:type="dxa"/>
-        <w:bottom w:w="0" w:type="dxa"/>
-        <w:right w:w="108" w:type="dxa"/>
-      </w:tblCellMar>
     </w:tblPr>
     <w:tblStylePr w:type="firstRow">
       <w:rPr>
@@ -4705,18 +4541,11 @@
     <w:tblPr>
       <w:tblStyleRowBandSize w:val="1"/>
       <w:tblStyleColBandSize w:val="1"/>
-      <w:tblInd w:w="0" w:type="dxa"/>
       <w:tblBorders>
         <w:bottom w:val="single" w:sz="4" w:space="0" w:color="4BACC6" w:themeColor="accent5"/>
         <w:insideH w:val="single" w:sz="4" w:space="0" w:color="4BACC6" w:themeColor="accent5"/>
         <w:insideV w:val="single" w:sz="4" w:space="0" w:color="4BACC6" w:themeColor="accent5"/>
       </w:tblBorders>
-      <w:tblCellMar>
-        <w:top w:w="0" w:type="dxa"/>
-        <w:left w:w="108" w:type="dxa"/>
-        <w:bottom w:w="0" w:type="dxa"/>
-        <w:right w:w="108" w:type="dxa"/>
-      </w:tblCellMar>
     </w:tblPr>
     <w:tblStylePr w:type="firstRow">
       <w:rPr>
@@ -4818,18 +4647,11 @@
     <w:tblPr>
       <w:tblStyleRowBandSize w:val="1"/>
       <w:tblStyleColBandSize w:val="1"/>
-      <w:tblInd w:w="0" w:type="dxa"/>
       <w:tblBorders>
         <w:bottom w:val="single" w:sz="4" w:space="0" w:color="F79646" w:themeColor="accent6"/>
         <w:insideH w:val="single" w:sz="4" w:space="0" w:color="F79646" w:themeColor="accent6"/>
         <w:insideV w:val="single" w:sz="4" w:space="0" w:color="F79646" w:themeColor="accent6"/>
       </w:tblBorders>
-      <w:tblCellMar>
-        <w:top w:w="0" w:type="dxa"/>
-        <w:left w:w="108" w:type="dxa"/>
-        <w:bottom w:w="0" w:type="dxa"/>
-        <w:right w:w="108" w:type="dxa"/>
-      </w:tblCellMar>
     </w:tblPr>
     <w:tblStylePr w:type="firstRow">
       <w:rPr>
@@ -4931,7 +4753,6 @@
     <w:tblPr>
       <w:tblStyleRowBandSize w:val="1"/>
       <w:tblStyleColBandSize w:val="1"/>
-      <w:tblInd w:w="0" w:type="dxa"/>
       <w:tblBorders>
         <w:top w:val="single" w:sz="4" w:space="0" w:color="6F6F6F" w:themeColor="text1" w:themeTint="90"/>
         <w:left w:val="single" w:sz="4" w:space="0" w:color="6F6F6F" w:themeColor="text1" w:themeTint="90"/>
@@ -4940,12 +4761,6 @@
         <w:insideH w:val="single" w:sz="4" w:space="0" w:color="6F6F6F" w:themeColor="text1" w:themeTint="90"/>
         <w:insideV w:val="single" w:sz="4" w:space="0" w:color="6F6F6F" w:themeColor="text1" w:themeTint="90"/>
       </w:tblBorders>
-      <w:tblCellMar>
-        <w:top w:w="0" w:type="dxa"/>
-        <w:left w:w="108" w:type="dxa"/>
-        <w:bottom w:w="0" w:type="dxa"/>
-        <w:right w:w="108" w:type="dxa"/>
-      </w:tblCellMar>
     </w:tblPr>
     <w:tblStylePr w:type="firstRow">
       <w:rPr>
@@ -5022,7 +4837,6 @@
     <w:tblPr>
       <w:tblStyleRowBandSize w:val="1"/>
       <w:tblStyleColBandSize w:val="1"/>
-      <w:tblInd w:w="0" w:type="dxa"/>
       <w:tblBorders>
         <w:top w:val="single" w:sz="4" w:space="0" w:color="9BB7D9" w:themeColor="accent1" w:themeTint="90"/>
         <w:left w:val="single" w:sz="4" w:space="0" w:color="9BB7D9" w:themeColor="accent1" w:themeTint="90"/>
@@ -5031,12 +4845,6 @@
         <w:insideH w:val="single" w:sz="4" w:space="0" w:color="9BB7D9" w:themeColor="accent1" w:themeTint="90"/>
         <w:insideV w:val="single" w:sz="4" w:space="0" w:color="9BB7D9" w:themeColor="accent1" w:themeTint="90"/>
       </w:tblBorders>
-      <w:tblCellMar>
-        <w:top w:w="0" w:type="dxa"/>
-        <w:left w:w="108" w:type="dxa"/>
-        <w:bottom w:w="0" w:type="dxa"/>
-        <w:right w:w="108" w:type="dxa"/>
-      </w:tblCellMar>
     </w:tblPr>
     <w:tblStylePr w:type="firstRow">
       <w:rPr>
@@ -5113,7 +4921,6 @@
     <w:tblPr>
       <w:tblStyleRowBandSize w:val="1"/>
       <w:tblStyleColBandSize w:val="1"/>
-      <w:tblInd w:w="0" w:type="dxa"/>
       <w:tblBorders>
         <w:top w:val="single" w:sz="4" w:space="0" w:color="DB9B9A" w:themeColor="accent2" w:themeTint="90"/>
         <w:left w:val="single" w:sz="4" w:space="0" w:color="DB9B9A" w:themeColor="accent2" w:themeTint="90"/>
@@ -5122,12 +4929,6 @@
         <w:insideH w:val="single" w:sz="4" w:space="0" w:color="DB9B9A" w:themeColor="accent2" w:themeTint="90"/>
         <w:insideV w:val="single" w:sz="4" w:space="0" w:color="DB9B9A" w:themeColor="accent2" w:themeTint="90"/>
       </w:tblBorders>
-      <w:tblCellMar>
-        <w:top w:w="0" w:type="dxa"/>
-        <w:left w:w="108" w:type="dxa"/>
-        <w:bottom w:w="0" w:type="dxa"/>
-        <w:right w:w="108" w:type="dxa"/>
-      </w:tblCellMar>
     </w:tblPr>
     <w:tblStylePr w:type="firstRow">
       <w:rPr>
@@ -5204,7 +5005,6 @@
     <w:tblPr>
       <w:tblStyleRowBandSize w:val="1"/>
       <w:tblStyleColBandSize w:val="1"/>
-      <w:tblInd w:w="0" w:type="dxa"/>
       <w:tblBorders>
         <w:top w:val="single" w:sz="4" w:space="0" w:color="C6D8A1" w:themeColor="accent3" w:themeTint="90"/>
         <w:left w:val="single" w:sz="4" w:space="0" w:color="C6D8A1" w:themeColor="accent3" w:themeTint="90"/>
@@ -5213,12 +5013,6 @@
         <w:insideH w:val="single" w:sz="4" w:space="0" w:color="C6D8A1" w:themeColor="accent3" w:themeTint="90"/>
         <w:insideV w:val="single" w:sz="4" w:space="0" w:color="C6D8A1" w:themeColor="accent3" w:themeTint="90"/>
       </w:tblBorders>
-      <w:tblCellMar>
-        <w:top w:w="0" w:type="dxa"/>
-        <w:left w:w="108" w:type="dxa"/>
-        <w:bottom w:w="0" w:type="dxa"/>
-        <w:right w:w="108" w:type="dxa"/>
-      </w:tblCellMar>
     </w:tblPr>
     <w:tblStylePr w:type="firstRow">
       <w:rPr>
@@ -5295,7 +5089,6 @@
     <w:tblPr>
       <w:tblStyleRowBandSize w:val="1"/>
       <w:tblStyleColBandSize w:val="1"/>
-      <w:tblInd w:w="0" w:type="dxa"/>
       <w:tblBorders>
         <w:top w:val="single" w:sz="4" w:space="0" w:color="B7A7CA" w:themeColor="accent4" w:themeTint="90"/>
         <w:left w:val="single" w:sz="4" w:space="0" w:color="B7A7CA" w:themeColor="accent4" w:themeTint="90"/>
@@ -5304,12 +5097,6 @@
         <w:insideH w:val="single" w:sz="4" w:space="0" w:color="B7A7CA" w:themeColor="accent4" w:themeTint="90"/>
         <w:insideV w:val="single" w:sz="4" w:space="0" w:color="B7A7CA" w:themeColor="accent4" w:themeTint="90"/>
       </w:tblBorders>
-      <w:tblCellMar>
-        <w:top w:w="0" w:type="dxa"/>
-        <w:left w:w="108" w:type="dxa"/>
-        <w:bottom w:w="0" w:type="dxa"/>
-        <w:right w:w="108" w:type="dxa"/>
-      </w:tblCellMar>
     </w:tblPr>
     <w:tblStylePr w:type="firstRow">
       <w:rPr>
@@ -5386,7 +5173,6 @@
     <w:tblPr>
       <w:tblStyleRowBandSize w:val="1"/>
       <w:tblStyleColBandSize w:val="1"/>
-      <w:tblInd w:w="0" w:type="dxa"/>
       <w:tblBorders>
         <w:top w:val="single" w:sz="4" w:space="0" w:color="99D0DE" w:themeColor="accent5" w:themeTint="90"/>
         <w:left w:val="single" w:sz="4" w:space="0" w:color="99D0DE" w:themeColor="accent5" w:themeTint="90"/>
@@ -5395,12 +5181,6 @@
         <w:insideH w:val="single" w:sz="4" w:space="0" w:color="99D0DE" w:themeColor="accent5" w:themeTint="90"/>
         <w:insideV w:val="single" w:sz="4" w:space="0" w:color="99D0DE" w:themeColor="accent5" w:themeTint="90"/>
       </w:tblBorders>
-      <w:tblCellMar>
-        <w:top w:w="0" w:type="dxa"/>
-        <w:left w:w="108" w:type="dxa"/>
-        <w:bottom w:w="0" w:type="dxa"/>
-        <w:right w:w="108" w:type="dxa"/>
-      </w:tblCellMar>
     </w:tblPr>
     <w:tblStylePr w:type="firstRow">
       <w:rPr>
@@ -5477,7 +5257,6 @@
     <w:tblPr>
       <w:tblStyleRowBandSize w:val="1"/>
       <w:tblStyleColBandSize w:val="1"/>
-      <w:tblInd w:w="0" w:type="dxa"/>
       <w:tblBorders>
         <w:top w:val="single" w:sz="4" w:space="0" w:color="FAC396" w:themeColor="accent6" w:themeTint="90"/>
         <w:left w:val="single" w:sz="4" w:space="0" w:color="FAC396" w:themeColor="accent6" w:themeTint="90"/>
@@ -5486,12 +5265,6 @@
         <w:insideH w:val="single" w:sz="4" w:space="0" w:color="FAC396" w:themeColor="accent6" w:themeTint="90"/>
         <w:insideV w:val="single" w:sz="4" w:space="0" w:color="FAC396" w:themeColor="accent6" w:themeTint="90"/>
       </w:tblBorders>
-      <w:tblCellMar>
-        <w:top w:w="0" w:type="dxa"/>
-        <w:left w:w="108" w:type="dxa"/>
-        <w:bottom w:w="0" w:type="dxa"/>
-        <w:right w:w="108" w:type="dxa"/>
-      </w:tblCellMar>
     </w:tblPr>
     <w:tblStylePr w:type="firstRow">
       <w:rPr>
@@ -5568,7 +5341,6 @@
     <w:tblPr>
       <w:tblStyleRowBandSize w:val="1"/>
       <w:tblStyleColBandSize w:val="1"/>
-      <w:tblInd w:w="0" w:type="dxa"/>
       <w:tblBorders>
         <w:top w:val="single" w:sz="4" w:space="0" w:color="FFFFFF" w:themeColor="light1"/>
         <w:left w:val="single" w:sz="4" w:space="0" w:color="FFFFFF" w:themeColor="light1"/>
@@ -5578,12 +5350,6 @@
         <w:insideV w:val="single" w:sz="4" w:space="0" w:color="FFFFFF" w:themeColor="light1"/>
       </w:tblBorders>
       <w:shd w:val="clear" w:color="BFBFBF" w:themeColor="text1" w:themeTint="40" w:fill="BFBFBF" w:themeFill="text1" w:themeFillTint="40"/>
-      <w:tblCellMar>
-        <w:top w:w="0" w:type="dxa"/>
-        <w:left w:w="108" w:type="dxa"/>
-        <w:bottom w:w="0" w:type="dxa"/>
-        <w:right w:w="108" w:type="dxa"/>
-      </w:tblCellMar>
     </w:tblPr>
     <w:tblStylePr w:type="firstRow">
       <w:rPr>
@@ -5659,7 +5425,6 @@
     <w:tblPr>
       <w:tblStyleRowBandSize w:val="1"/>
       <w:tblStyleColBandSize w:val="1"/>
-      <w:tblInd w:w="0" w:type="dxa"/>
       <w:tblBorders>
         <w:top w:val="single" w:sz="4" w:space="0" w:color="FFFFFF" w:themeColor="light1"/>
         <w:left w:val="single" w:sz="4" w:space="0" w:color="FFFFFF" w:themeColor="light1"/>
@@ -5669,12 +5434,6 @@
         <w:insideV w:val="single" w:sz="4" w:space="0" w:color="FFFFFF" w:themeColor="light1"/>
       </w:tblBorders>
       <w:shd w:val="clear" w:color="DAE5F1" w:themeColor="accent1" w:themeTint="34" w:fill="DAE5F1" w:themeFill="accent1" w:themeFillTint="34"/>
-      <w:tblCellMar>
-        <w:top w:w="0" w:type="dxa"/>
-        <w:left w:w="108" w:type="dxa"/>
-        <w:bottom w:w="0" w:type="dxa"/>
-        <w:right w:w="108" w:type="dxa"/>
-      </w:tblCellMar>
     </w:tblPr>
     <w:tblStylePr w:type="firstRow">
       <w:rPr>
@@ -5750,7 +5509,6 @@
     <w:tblPr>
       <w:tblStyleRowBandSize w:val="1"/>
       <w:tblStyleColBandSize w:val="1"/>
-      <w:tblInd w:w="0" w:type="dxa"/>
       <w:tblBorders>
         <w:top w:val="single" w:sz="4" w:space="0" w:color="FFFFFF" w:themeColor="light1"/>
         <w:left w:val="single" w:sz="4" w:space="0" w:color="FFFFFF" w:themeColor="light1"/>
@@ -5760,12 +5518,6 @@
         <w:insideV w:val="single" w:sz="4" w:space="0" w:color="FFFFFF" w:themeColor="light1"/>
       </w:tblBorders>
       <w:shd w:val="clear" w:color="F2DCDC" w:themeColor="accent2" w:themeTint="32" w:fill="F2DCDC" w:themeFill="accent2" w:themeFillTint="32"/>
-      <w:tblCellMar>
-        <w:top w:w="0" w:type="dxa"/>
-        <w:left w:w="108" w:type="dxa"/>
-        <w:bottom w:w="0" w:type="dxa"/>
-        <w:right w:w="108" w:type="dxa"/>
-      </w:tblCellMar>
     </w:tblPr>
     <w:tblStylePr w:type="firstRow">
       <w:rPr>
@@ -5841,7 +5593,6 @@
     <w:tblPr>
       <w:tblStyleRowBandSize w:val="1"/>
       <w:tblStyleColBandSize w:val="1"/>
-      <w:tblInd w:w="0" w:type="dxa"/>
       <w:tblBorders>
         <w:top w:val="single" w:sz="4" w:space="0" w:color="FFFFFF" w:themeColor="light1"/>
         <w:left w:val="single" w:sz="4" w:space="0" w:color="FFFFFF" w:themeColor="light1"/>
@@ -5851,12 +5602,6 @@
         <w:insideV w:val="single" w:sz="4" w:space="0" w:color="FFFFFF" w:themeColor="light1"/>
       </w:tblBorders>
       <w:shd w:val="clear" w:color="EAF1DC" w:themeColor="accent3" w:themeTint="34" w:fill="EAF1DC" w:themeFill="accent3" w:themeFillTint="34"/>
-      <w:tblCellMar>
-        <w:top w:w="0" w:type="dxa"/>
-        <w:left w:w="108" w:type="dxa"/>
-        <w:bottom w:w="0" w:type="dxa"/>
-        <w:right w:w="108" w:type="dxa"/>
-      </w:tblCellMar>
     </w:tblPr>
     <w:tblStylePr w:type="firstRow">
       <w:rPr>
@@ -5932,7 +5677,6 @@
     <w:tblPr>
       <w:tblStyleRowBandSize w:val="1"/>
       <w:tblStyleColBandSize w:val="1"/>
-      <w:tblInd w:w="0" w:type="dxa"/>
       <w:tblBorders>
         <w:top w:val="single" w:sz="4" w:space="0" w:color="FFFFFF" w:themeColor="light1"/>
         <w:left w:val="single" w:sz="4" w:space="0" w:color="FFFFFF" w:themeColor="light1"/>
@@ -5942,12 +5686,6 @@
         <w:insideV w:val="single" w:sz="4" w:space="0" w:color="FFFFFF" w:themeColor="light1"/>
       </w:tblBorders>
       <w:shd w:val="clear" w:color="E5DFEC" w:themeColor="accent4" w:themeTint="34" w:fill="E5DFEC" w:themeFill="accent4" w:themeFillTint="34"/>
-      <w:tblCellMar>
-        <w:top w:w="0" w:type="dxa"/>
-        <w:left w:w="108" w:type="dxa"/>
-        <w:bottom w:w="0" w:type="dxa"/>
-        <w:right w:w="108" w:type="dxa"/>
-      </w:tblCellMar>
     </w:tblPr>
     <w:tblStylePr w:type="firstRow">
       <w:rPr>
@@ -6023,7 +5761,6 @@
     <w:tblPr>
       <w:tblStyleRowBandSize w:val="1"/>
       <w:tblStyleColBandSize w:val="1"/>
-      <w:tblInd w:w="0" w:type="dxa"/>
       <w:tblBorders>
         <w:top w:val="single" w:sz="4" w:space="0" w:color="FFFFFF" w:themeColor="light1"/>
         <w:left w:val="single" w:sz="4" w:space="0" w:color="FFFFFF" w:themeColor="light1"/>
@@ -6033,12 +5770,6 @@
         <w:insideV w:val="single" w:sz="4" w:space="0" w:color="FFFFFF" w:themeColor="light1"/>
       </w:tblBorders>
       <w:shd w:val="clear" w:color="DAEEF3" w:themeColor="accent5" w:themeTint="34" w:fill="DAEEF3" w:themeFill="accent5" w:themeFillTint="34"/>
-      <w:tblCellMar>
-        <w:top w:w="0" w:type="dxa"/>
-        <w:left w:w="108" w:type="dxa"/>
-        <w:bottom w:w="0" w:type="dxa"/>
-        <w:right w:w="108" w:type="dxa"/>
-      </w:tblCellMar>
     </w:tblPr>
     <w:tblStylePr w:type="firstRow">
       <w:rPr>
@@ -6114,7 +5845,6 @@
     <w:tblPr>
       <w:tblStyleRowBandSize w:val="1"/>
       <w:tblStyleColBandSize w:val="1"/>
-      <w:tblInd w:w="0" w:type="dxa"/>
       <w:tblBorders>
         <w:top w:val="single" w:sz="4" w:space="0" w:color="FFFFFF" w:themeColor="light1"/>
         <w:left w:val="single" w:sz="4" w:space="0" w:color="FFFFFF" w:themeColor="light1"/>
@@ -6124,12 +5854,6 @@
         <w:insideV w:val="single" w:sz="4" w:space="0" w:color="FFFFFF" w:themeColor="light1"/>
       </w:tblBorders>
       <w:shd w:val="clear" w:color="FDE9D8" w:themeColor="accent6" w:themeTint="34" w:fill="FDE9D8" w:themeFill="accent6" w:themeFillTint="34"/>
-      <w:tblCellMar>
-        <w:top w:w="0" w:type="dxa"/>
-        <w:left w:w="108" w:type="dxa"/>
-        <w:bottom w:w="0" w:type="dxa"/>
-        <w:right w:w="108" w:type="dxa"/>
-      </w:tblCellMar>
     </w:tblPr>
     <w:tblStylePr w:type="firstRow">
       <w:rPr>
@@ -6205,7 +5929,6 @@
     <w:tblPr>
       <w:tblStyleRowBandSize w:val="1"/>
       <w:tblStyleColBandSize w:val="1"/>
-      <w:tblInd w:w="0" w:type="dxa"/>
       <w:tblBorders>
         <w:top w:val="single" w:sz="4" w:space="0" w:color="7F7F7F" w:themeColor="text1" w:themeTint="80"/>
         <w:left w:val="single" w:sz="4" w:space="0" w:color="7F7F7F" w:themeColor="text1" w:themeTint="80"/>
@@ -6214,12 +5937,6 @@
         <w:insideH w:val="single" w:sz="4" w:space="0" w:color="7F7F7F" w:themeColor="text1" w:themeTint="80"/>
         <w:insideV w:val="single" w:sz="4" w:space="0" w:color="7F7F7F" w:themeColor="text1" w:themeTint="80"/>
       </w:tblBorders>
-      <w:tblCellMar>
-        <w:top w:w="0" w:type="dxa"/>
-        <w:left w:w="108" w:type="dxa"/>
-        <w:bottom w:w="0" w:type="dxa"/>
-        <w:right w:w="108" w:type="dxa"/>
-      </w:tblCellMar>
     </w:tblPr>
     <w:tblStylePr w:type="firstRow">
       <w:rPr>
@@ -6286,7 +6003,6 @@
     <w:tblPr>
       <w:tblStyleRowBandSize w:val="1"/>
       <w:tblStyleColBandSize w:val="1"/>
-      <w:tblInd w:w="0" w:type="dxa"/>
       <w:tblBorders>
         <w:top w:val="single" w:sz="4" w:space="0" w:color="A6BFDD" w:themeColor="accent1" w:themeTint="80"/>
         <w:left w:val="single" w:sz="4" w:space="0" w:color="A6BFDD" w:themeColor="accent1" w:themeTint="80"/>
@@ -6295,12 +6011,6 @@
         <w:insideH w:val="single" w:sz="4" w:space="0" w:color="A6BFDD" w:themeColor="accent1" w:themeTint="80"/>
         <w:insideV w:val="single" w:sz="4" w:space="0" w:color="A6BFDD" w:themeColor="accent1" w:themeTint="80"/>
       </w:tblBorders>
-      <w:tblCellMar>
-        <w:top w:w="0" w:type="dxa"/>
-        <w:left w:w="108" w:type="dxa"/>
-        <w:bottom w:w="0" w:type="dxa"/>
-        <w:right w:w="108" w:type="dxa"/>
-      </w:tblCellMar>
     </w:tblPr>
     <w:tblStylePr w:type="firstRow">
       <w:rPr>
@@ -6367,7 +6077,6 @@
     <w:tblPr>
       <w:tblStyleRowBandSize w:val="1"/>
       <w:tblStyleColBandSize w:val="1"/>
-      <w:tblInd w:w="0" w:type="dxa"/>
       <w:tblBorders>
         <w:top w:val="single" w:sz="4" w:space="0" w:color="D99695" w:themeColor="accent2" w:themeTint="97"/>
         <w:left w:val="single" w:sz="4" w:space="0" w:color="D99695" w:themeColor="accent2" w:themeTint="97"/>
@@ -6376,12 +6085,6 @@
         <w:insideH w:val="single" w:sz="4" w:space="0" w:color="D99695" w:themeColor="accent2" w:themeTint="97"/>
         <w:insideV w:val="single" w:sz="4" w:space="0" w:color="D99695" w:themeColor="accent2" w:themeTint="97"/>
       </w:tblBorders>
-      <w:tblCellMar>
-        <w:top w:w="0" w:type="dxa"/>
-        <w:left w:w="108" w:type="dxa"/>
-        <w:bottom w:w="0" w:type="dxa"/>
-        <w:right w:w="108" w:type="dxa"/>
-      </w:tblCellMar>
     </w:tblPr>
     <w:tblStylePr w:type="firstRow">
       <w:rPr>
@@ -6448,7 +6151,6 @@
     <w:tblPr>
       <w:tblStyleRowBandSize w:val="1"/>
       <w:tblStyleColBandSize w:val="1"/>
-      <w:tblInd w:w="0" w:type="dxa"/>
       <w:tblBorders>
         <w:top w:val="single" w:sz="4" w:space="0" w:color="9ABB59" w:themeColor="accent3" w:themeTint="FE"/>
         <w:left w:val="single" w:sz="4" w:space="0" w:color="9ABB59" w:themeColor="accent3" w:themeTint="FE"/>
@@ -6457,12 +6159,6 @@
         <w:insideH w:val="single" w:sz="4" w:space="0" w:color="9ABB59" w:themeColor="accent3" w:themeTint="FE"/>
         <w:insideV w:val="single" w:sz="4" w:space="0" w:color="9ABB59" w:themeColor="accent3" w:themeTint="FE"/>
       </w:tblBorders>
-      <w:tblCellMar>
-        <w:top w:w="0" w:type="dxa"/>
-        <w:left w:w="108" w:type="dxa"/>
-        <w:bottom w:w="0" w:type="dxa"/>
-        <w:right w:w="108" w:type="dxa"/>
-      </w:tblCellMar>
     </w:tblPr>
     <w:tblStylePr w:type="firstRow">
       <w:rPr>
@@ -6529,7 +6225,6 @@
     <w:tblPr>
       <w:tblStyleRowBandSize w:val="1"/>
       <w:tblStyleColBandSize w:val="1"/>
-      <w:tblInd w:w="0" w:type="dxa"/>
       <w:tblBorders>
         <w:top w:val="single" w:sz="4" w:space="0" w:color="B2A1C6" w:themeColor="accent4" w:themeTint="9A"/>
         <w:left w:val="single" w:sz="4" w:space="0" w:color="B2A1C6" w:themeColor="accent4" w:themeTint="9A"/>
@@ -6538,12 +6233,6 @@
         <w:insideH w:val="single" w:sz="4" w:space="0" w:color="B2A1C6" w:themeColor="accent4" w:themeTint="9A"/>
         <w:insideV w:val="single" w:sz="4" w:space="0" w:color="B2A1C6" w:themeColor="accent4" w:themeTint="9A"/>
       </w:tblBorders>
-      <w:tblCellMar>
-        <w:top w:w="0" w:type="dxa"/>
-        <w:left w:w="108" w:type="dxa"/>
-        <w:bottom w:w="0" w:type="dxa"/>
-        <w:right w:w="108" w:type="dxa"/>
-      </w:tblCellMar>
     </w:tblPr>
     <w:tblStylePr w:type="firstRow">
       <w:rPr>
@@ -6610,7 +6299,6 @@
     <w:tblPr>
       <w:tblStyleRowBandSize w:val="1"/>
       <w:tblStyleColBandSize w:val="1"/>
-      <w:tblInd w:w="0" w:type="dxa"/>
       <w:tblBorders>
         <w:top w:val="single" w:sz="4" w:space="0" w:color="4BACC6" w:themeColor="accent5"/>
         <w:left w:val="single" w:sz="4" w:space="0" w:color="4BACC6" w:themeColor="accent5"/>
@@ -6619,12 +6307,6 @@
         <w:insideH w:val="single" w:sz="4" w:space="0" w:color="4BACC6" w:themeColor="accent5"/>
         <w:insideV w:val="single" w:sz="4" w:space="0" w:color="4BACC6" w:themeColor="accent5"/>
       </w:tblBorders>
-      <w:tblCellMar>
-        <w:top w:w="0" w:type="dxa"/>
-        <w:left w:w="108" w:type="dxa"/>
-        <w:bottom w:w="0" w:type="dxa"/>
-        <w:right w:w="108" w:type="dxa"/>
-      </w:tblCellMar>
     </w:tblPr>
     <w:tblStylePr w:type="firstRow">
       <w:rPr>
@@ -6691,7 +6373,6 @@
     <w:tblPr>
       <w:tblStyleRowBandSize w:val="1"/>
       <w:tblStyleColBandSize w:val="1"/>
-      <w:tblInd w:w="0" w:type="dxa"/>
       <w:tblBorders>
         <w:top w:val="single" w:sz="4" w:space="0" w:color="F79646" w:themeColor="accent6"/>
         <w:left w:val="single" w:sz="4" w:space="0" w:color="F79646" w:themeColor="accent6"/>
@@ -6700,12 +6381,6 @@
         <w:insideH w:val="single" w:sz="4" w:space="0" w:color="F79646" w:themeColor="accent6"/>
         <w:insideV w:val="single" w:sz="4" w:space="0" w:color="F79646" w:themeColor="accent6"/>
       </w:tblBorders>
-      <w:tblCellMar>
-        <w:top w:w="0" w:type="dxa"/>
-        <w:left w:w="108" w:type="dxa"/>
-        <w:bottom w:w="0" w:type="dxa"/>
-        <w:right w:w="108" w:type="dxa"/>
-      </w:tblCellMar>
     </w:tblPr>
     <w:tblStylePr w:type="firstRow">
       <w:rPr>
@@ -6772,19 +6447,12 @@
     <w:tblPr>
       <w:tblStyleRowBandSize w:val="1"/>
       <w:tblStyleColBandSize w:val="1"/>
-      <w:tblInd w:w="0" w:type="dxa"/>
       <w:tblBorders>
         <w:bottom w:val="single" w:sz="4" w:space="0" w:color="7F7F7F" w:themeColor="text1" w:themeTint="80"/>
         <w:right w:val="single" w:sz="4" w:space="0" w:color="7F7F7F" w:themeColor="text1" w:themeTint="80"/>
         <w:insideH w:val="single" w:sz="4" w:space="0" w:color="7F7F7F" w:themeColor="text1" w:themeTint="80"/>
         <w:insideV w:val="single" w:sz="4" w:space="0" w:color="7F7F7F" w:themeColor="text1" w:themeTint="80"/>
       </w:tblBorders>
-      <w:tblCellMar>
-        <w:top w:w="0" w:type="dxa"/>
-        <w:left w:w="108" w:type="dxa"/>
-        <w:bottom w:w="0" w:type="dxa"/>
-        <w:right w:w="108" w:type="dxa"/>
-      </w:tblCellMar>
     </w:tblPr>
     <w:tblStylePr w:type="firstRow">
       <w:rPr>
@@ -6896,19 +6564,12 @@
     <w:tblPr>
       <w:tblStyleRowBandSize w:val="1"/>
       <w:tblStyleColBandSize w:val="1"/>
-      <w:tblInd w:w="0" w:type="dxa"/>
       <w:tblBorders>
         <w:bottom w:val="single" w:sz="4" w:space="0" w:color="A6BFDD" w:themeColor="accent1" w:themeTint="80"/>
         <w:right w:val="single" w:sz="4" w:space="0" w:color="A6BFDD" w:themeColor="accent1" w:themeTint="80"/>
         <w:insideH w:val="single" w:sz="4" w:space="0" w:color="A6BFDD" w:themeColor="accent1" w:themeTint="80"/>
         <w:insideV w:val="single" w:sz="4" w:space="0" w:color="A6BFDD" w:themeColor="accent1" w:themeTint="80"/>
       </w:tblBorders>
-      <w:tblCellMar>
-        <w:top w:w="0" w:type="dxa"/>
-        <w:left w:w="108" w:type="dxa"/>
-        <w:bottom w:w="0" w:type="dxa"/>
-        <w:right w:w="108" w:type="dxa"/>
-      </w:tblCellMar>
     </w:tblPr>
     <w:tblStylePr w:type="firstRow">
       <w:rPr>
@@ -7020,19 +6681,12 @@
     <w:tblPr>
       <w:tblStyleRowBandSize w:val="1"/>
       <w:tblStyleColBandSize w:val="1"/>
-      <w:tblInd w:w="0" w:type="dxa"/>
       <w:tblBorders>
         <w:bottom w:val="single" w:sz="4" w:space="0" w:color="D99695" w:themeColor="accent2" w:themeTint="97"/>
         <w:right w:val="single" w:sz="4" w:space="0" w:color="D99695" w:themeColor="accent2" w:themeTint="97"/>
         <w:insideH w:val="single" w:sz="4" w:space="0" w:color="D99695" w:themeColor="accent2" w:themeTint="97"/>
         <w:insideV w:val="single" w:sz="4" w:space="0" w:color="D99695" w:themeColor="accent2" w:themeTint="97"/>
       </w:tblBorders>
-      <w:tblCellMar>
-        <w:top w:w="0" w:type="dxa"/>
-        <w:left w:w="108" w:type="dxa"/>
-        <w:bottom w:w="0" w:type="dxa"/>
-        <w:right w:w="108" w:type="dxa"/>
-      </w:tblCellMar>
     </w:tblPr>
     <w:tblStylePr w:type="firstRow">
       <w:rPr>
@@ -7144,19 +6798,12 @@
     <w:tblPr>
       <w:tblStyleRowBandSize w:val="1"/>
       <w:tblStyleColBandSize w:val="1"/>
-      <w:tblInd w:w="0" w:type="dxa"/>
       <w:tblBorders>
         <w:bottom w:val="single" w:sz="4" w:space="0" w:color="9ABB59" w:themeColor="accent3" w:themeTint="FE"/>
         <w:right w:val="single" w:sz="4" w:space="0" w:color="9ABB59" w:themeColor="accent3" w:themeTint="FE"/>
         <w:insideH w:val="single" w:sz="4" w:space="0" w:color="9ABB59" w:themeColor="accent3" w:themeTint="FE"/>
         <w:insideV w:val="single" w:sz="4" w:space="0" w:color="9ABB59" w:themeColor="accent3" w:themeTint="FE"/>
       </w:tblBorders>
-      <w:tblCellMar>
-        <w:top w:w="0" w:type="dxa"/>
-        <w:left w:w="108" w:type="dxa"/>
-        <w:bottom w:w="0" w:type="dxa"/>
-        <w:right w:w="108" w:type="dxa"/>
-      </w:tblCellMar>
     </w:tblPr>
     <w:tblStylePr w:type="firstRow">
       <w:rPr>
@@ -7268,19 +6915,12 @@
     <w:tblPr>
       <w:tblStyleRowBandSize w:val="1"/>
       <w:tblStyleColBandSize w:val="1"/>
-      <w:tblInd w:w="0" w:type="dxa"/>
       <w:tblBorders>
         <w:bottom w:val="single" w:sz="4" w:space="0" w:color="B2A1C6" w:themeColor="accent4" w:themeTint="9A"/>
         <w:right w:val="single" w:sz="4" w:space="0" w:color="B2A1C6" w:themeColor="accent4" w:themeTint="9A"/>
         <w:insideH w:val="single" w:sz="4" w:space="0" w:color="B2A1C6" w:themeColor="accent4" w:themeTint="9A"/>
         <w:insideV w:val="single" w:sz="4" w:space="0" w:color="B2A1C6" w:themeColor="accent4" w:themeTint="9A"/>
       </w:tblBorders>
-      <w:tblCellMar>
-        <w:top w:w="0" w:type="dxa"/>
-        <w:left w:w="108" w:type="dxa"/>
-        <w:bottom w:w="0" w:type="dxa"/>
-        <w:right w:w="108" w:type="dxa"/>
-      </w:tblCellMar>
     </w:tblPr>
     <w:tblStylePr w:type="firstRow">
       <w:rPr>
@@ -7392,19 +7032,12 @@
     <w:tblPr>
       <w:tblStyleRowBandSize w:val="1"/>
       <w:tblStyleColBandSize w:val="1"/>
-      <w:tblInd w:w="0" w:type="dxa"/>
       <w:tblBorders>
         <w:bottom w:val="single" w:sz="4" w:space="0" w:color="99D0DE" w:themeColor="accent5" w:themeTint="90"/>
         <w:right w:val="single" w:sz="4" w:space="0" w:color="99D0DE" w:themeColor="accent5" w:themeTint="90"/>
         <w:insideH w:val="single" w:sz="4" w:space="0" w:color="99D0DE" w:themeColor="accent5" w:themeTint="90"/>
         <w:insideV w:val="single" w:sz="4" w:space="0" w:color="99D0DE" w:themeColor="accent5" w:themeTint="90"/>
       </w:tblBorders>
-      <w:tblCellMar>
-        <w:top w:w="0" w:type="dxa"/>
-        <w:left w:w="108" w:type="dxa"/>
-        <w:bottom w:w="0" w:type="dxa"/>
-        <w:right w:w="108" w:type="dxa"/>
-      </w:tblCellMar>
     </w:tblPr>
     <w:tblStylePr w:type="firstRow">
       <w:rPr>
@@ -7516,19 +7149,12 @@
     <w:tblPr>
       <w:tblStyleRowBandSize w:val="1"/>
       <w:tblStyleColBandSize w:val="1"/>
-      <w:tblInd w:w="0" w:type="dxa"/>
       <w:tblBorders>
         <w:bottom w:val="single" w:sz="4" w:space="0" w:color="FAC396" w:themeColor="accent6" w:themeTint="90"/>
         <w:right w:val="single" w:sz="4" w:space="0" w:color="FAC396" w:themeColor="accent6" w:themeTint="90"/>
         <w:insideH w:val="single" w:sz="4" w:space="0" w:color="FAC396" w:themeColor="accent6" w:themeTint="90"/>
         <w:insideV w:val="single" w:sz="4" w:space="0" w:color="FAC396" w:themeColor="accent6" w:themeTint="90"/>
       </w:tblBorders>
-      <w:tblCellMar>
-        <w:top w:w="0" w:type="dxa"/>
-        <w:left w:w="108" w:type="dxa"/>
-        <w:bottom w:w="0" w:type="dxa"/>
-        <w:right w:w="108" w:type="dxa"/>
-      </w:tblCellMar>
     </w:tblPr>
     <w:tblStylePr w:type="firstRow">
       <w:rPr>
@@ -7640,13 +7266,6 @@
     <w:tblPr>
       <w:tblStyleRowBandSize w:val="1"/>
       <w:tblStyleColBandSize w:val="1"/>
-      <w:tblInd w:w="0" w:type="dxa"/>
-      <w:tblCellMar>
-        <w:top w:w="0" w:type="dxa"/>
-        <w:left w:w="108" w:type="dxa"/>
-        <w:bottom w:w="0" w:type="dxa"/>
-        <w:right w:w="108" w:type="dxa"/>
-      </w:tblCellMar>
     </w:tblPr>
     <w:tblStylePr w:type="firstRow">
       <w:rPr>
@@ -7713,13 +7332,6 @@
     <w:tblPr>
       <w:tblStyleRowBandSize w:val="1"/>
       <w:tblStyleColBandSize w:val="1"/>
-      <w:tblInd w:w="0" w:type="dxa"/>
-      <w:tblCellMar>
-        <w:top w:w="0" w:type="dxa"/>
-        <w:left w:w="108" w:type="dxa"/>
-        <w:bottom w:w="0" w:type="dxa"/>
-        <w:right w:w="108" w:type="dxa"/>
-      </w:tblCellMar>
     </w:tblPr>
     <w:tblStylePr w:type="firstRow">
       <w:rPr>
@@ -7786,13 +7398,6 @@
     <w:tblPr>
       <w:tblStyleRowBandSize w:val="1"/>
       <w:tblStyleColBandSize w:val="1"/>
-      <w:tblInd w:w="0" w:type="dxa"/>
-      <w:tblCellMar>
-        <w:top w:w="0" w:type="dxa"/>
-        <w:left w:w="108" w:type="dxa"/>
-        <w:bottom w:w="0" w:type="dxa"/>
-        <w:right w:w="108" w:type="dxa"/>
-      </w:tblCellMar>
     </w:tblPr>
     <w:tblStylePr w:type="firstRow">
       <w:rPr>
@@ -7859,13 +7464,6 @@
     <w:tblPr>
       <w:tblStyleRowBandSize w:val="1"/>
       <w:tblStyleColBandSize w:val="1"/>
-      <w:tblInd w:w="0" w:type="dxa"/>
-      <w:tblCellMar>
-        <w:top w:w="0" w:type="dxa"/>
-        <w:left w:w="108" w:type="dxa"/>
-        <w:bottom w:w="0" w:type="dxa"/>
-        <w:right w:w="108" w:type="dxa"/>
-      </w:tblCellMar>
     </w:tblPr>
     <w:tblStylePr w:type="firstRow">
       <w:rPr>
@@ -7932,13 +7530,6 @@
     <w:tblPr>
       <w:tblStyleRowBandSize w:val="1"/>
       <w:tblStyleColBandSize w:val="1"/>
-      <w:tblInd w:w="0" w:type="dxa"/>
-      <w:tblCellMar>
-        <w:top w:w="0" w:type="dxa"/>
-        <w:left w:w="108" w:type="dxa"/>
-        <w:bottom w:w="0" w:type="dxa"/>
-        <w:right w:w="108" w:type="dxa"/>
-      </w:tblCellMar>
     </w:tblPr>
     <w:tblStylePr w:type="firstRow">
       <w:rPr>
@@ -8005,13 +7596,6 @@
     <w:tblPr>
       <w:tblStyleRowBandSize w:val="1"/>
       <w:tblStyleColBandSize w:val="1"/>
-      <w:tblInd w:w="0" w:type="dxa"/>
-      <w:tblCellMar>
-        <w:top w:w="0" w:type="dxa"/>
-        <w:left w:w="108" w:type="dxa"/>
-        <w:bottom w:w="0" w:type="dxa"/>
-        <w:right w:w="108" w:type="dxa"/>
-      </w:tblCellMar>
     </w:tblPr>
     <w:tblStylePr w:type="firstRow">
       <w:rPr>
@@ -8078,13 +7662,6 @@
     <w:tblPr>
       <w:tblStyleRowBandSize w:val="1"/>
       <w:tblStyleColBandSize w:val="1"/>
-      <w:tblInd w:w="0" w:type="dxa"/>
-      <w:tblCellMar>
-        <w:top w:w="0" w:type="dxa"/>
-        <w:left w:w="108" w:type="dxa"/>
-        <w:bottom w:w="0" w:type="dxa"/>
-        <w:right w:w="108" w:type="dxa"/>
-      </w:tblCellMar>
     </w:tblPr>
     <w:tblStylePr w:type="firstRow">
       <w:rPr>
@@ -8151,18 +7728,11 @@
     <w:tblPr>
       <w:tblStyleRowBandSize w:val="1"/>
       <w:tblStyleColBandSize w:val="1"/>
-      <w:tblInd w:w="0" w:type="dxa"/>
       <w:tblBorders>
         <w:top w:val="single" w:sz="4" w:space="0" w:color="6F6F6F" w:themeColor="text1" w:themeTint="90"/>
         <w:bottom w:val="single" w:sz="4" w:space="0" w:color="6F6F6F" w:themeColor="text1" w:themeTint="90"/>
         <w:insideH w:val="single" w:sz="4" w:space="0" w:color="6F6F6F" w:themeColor="text1" w:themeTint="90"/>
       </w:tblBorders>
-      <w:tblCellMar>
-        <w:top w:w="0" w:type="dxa"/>
-        <w:left w:w="108" w:type="dxa"/>
-        <w:bottom w:w="0" w:type="dxa"/>
-        <w:right w:w="108" w:type="dxa"/>
-      </w:tblCellMar>
     </w:tblPr>
     <w:tblStylePr w:type="firstRow">
       <w:rPr>
@@ -8247,18 +7817,11 @@
     <w:tblPr>
       <w:tblStyleRowBandSize w:val="1"/>
       <w:tblStyleColBandSize w:val="1"/>
-      <w:tblInd w:w="0" w:type="dxa"/>
       <w:tblBorders>
         <w:top w:val="single" w:sz="4" w:space="0" w:color="9BB7D9" w:themeColor="accent1" w:themeTint="90"/>
         <w:bottom w:val="single" w:sz="4" w:space="0" w:color="9BB7D9" w:themeColor="accent1" w:themeTint="90"/>
         <w:insideH w:val="single" w:sz="4" w:space="0" w:color="9BB7D9" w:themeColor="accent1" w:themeTint="90"/>
       </w:tblBorders>
-      <w:tblCellMar>
-        <w:top w:w="0" w:type="dxa"/>
-        <w:left w:w="108" w:type="dxa"/>
-        <w:bottom w:w="0" w:type="dxa"/>
-        <w:right w:w="108" w:type="dxa"/>
-      </w:tblCellMar>
     </w:tblPr>
     <w:tblStylePr w:type="firstRow">
       <w:rPr>
@@ -8343,18 +7906,11 @@
     <w:tblPr>
       <w:tblStyleRowBandSize w:val="1"/>
       <w:tblStyleColBandSize w:val="1"/>
-      <w:tblInd w:w="0" w:type="dxa"/>
       <w:tblBorders>
         <w:top w:val="single" w:sz="4" w:space="0" w:color="DB9B9A" w:themeColor="accent2" w:themeTint="90"/>
         <w:bottom w:val="single" w:sz="4" w:space="0" w:color="DB9B9A" w:themeColor="accent2" w:themeTint="90"/>
         <w:insideH w:val="single" w:sz="4" w:space="0" w:color="DB9B9A" w:themeColor="accent2" w:themeTint="90"/>
       </w:tblBorders>
-      <w:tblCellMar>
-        <w:top w:w="0" w:type="dxa"/>
-        <w:left w:w="108" w:type="dxa"/>
-        <w:bottom w:w="0" w:type="dxa"/>
-        <w:right w:w="108" w:type="dxa"/>
-      </w:tblCellMar>
     </w:tblPr>
     <w:tblStylePr w:type="firstRow">
       <w:rPr>
@@ -8439,18 +7995,11 @@
     <w:tblPr>
       <w:tblStyleRowBandSize w:val="1"/>
       <w:tblStyleColBandSize w:val="1"/>
-      <w:tblInd w:w="0" w:type="dxa"/>
       <w:tblBorders>
         <w:top w:val="single" w:sz="4" w:space="0" w:color="C6D8A1" w:themeColor="accent3" w:themeTint="90"/>
         <w:bottom w:val="single" w:sz="4" w:space="0" w:color="C6D8A1" w:themeColor="accent3" w:themeTint="90"/>
         <w:insideH w:val="single" w:sz="4" w:space="0" w:color="C6D8A1" w:themeColor="accent3" w:themeTint="90"/>
       </w:tblBorders>
-      <w:tblCellMar>
-        <w:top w:w="0" w:type="dxa"/>
-        <w:left w:w="108" w:type="dxa"/>
-        <w:bottom w:w="0" w:type="dxa"/>
-        <w:right w:w="108" w:type="dxa"/>
-      </w:tblCellMar>
     </w:tblPr>
     <w:tblStylePr w:type="firstRow">
       <w:rPr>
@@ -8535,18 +8084,11 @@
     <w:tblPr>
       <w:tblStyleRowBandSize w:val="1"/>
       <w:tblStyleColBandSize w:val="1"/>
-      <w:tblInd w:w="0" w:type="dxa"/>
       <w:tblBorders>
         <w:top w:val="single" w:sz="4" w:space="0" w:color="B7A7CA" w:themeColor="accent4" w:themeTint="90"/>
         <w:bottom w:val="single" w:sz="4" w:space="0" w:color="B7A7CA" w:themeColor="accent4" w:themeTint="90"/>
         <w:insideH w:val="single" w:sz="4" w:space="0" w:color="B7A7CA" w:themeColor="accent4" w:themeTint="90"/>
       </w:tblBorders>
-      <w:tblCellMar>
-        <w:top w:w="0" w:type="dxa"/>
-        <w:left w:w="108" w:type="dxa"/>
-        <w:bottom w:w="0" w:type="dxa"/>
-        <w:right w:w="108" w:type="dxa"/>
-      </w:tblCellMar>
     </w:tblPr>
     <w:tblStylePr w:type="firstRow">
       <w:rPr>
@@ -8631,18 +8173,11 @@
     <w:tblPr>
       <w:tblStyleRowBandSize w:val="1"/>
       <w:tblStyleColBandSize w:val="1"/>
-      <w:tblInd w:w="0" w:type="dxa"/>
       <w:tblBorders>
         <w:top w:val="single" w:sz="4" w:space="0" w:color="99D0DE" w:themeColor="accent5" w:themeTint="90"/>
         <w:bottom w:val="single" w:sz="4" w:space="0" w:color="99D0DE" w:themeColor="accent5" w:themeTint="90"/>
         <w:insideH w:val="single" w:sz="4" w:space="0" w:color="99D0DE" w:themeColor="accent5" w:themeTint="90"/>
       </w:tblBorders>
-      <w:tblCellMar>
-        <w:top w:w="0" w:type="dxa"/>
-        <w:left w:w="108" w:type="dxa"/>
-        <w:bottom w:w="0" w:type="dxa"/>
-        <w:right w:w="108" w:type="dxa"/>
-      </w:tblCellMar>
     </w:tblPr>
     <w:tblStylePr w:type="firstRow">
       <w:rPr>
@@ -8727,18 +8262,11 @@
     <w:tblPr>
       <w:tblStyleRowBandSize w:val="1"/>
       <w:tblStyleColBandSize w:val="1"/>
-      <w:tblInd w:w="0" w:type="dxa"/>
       <w:tblBorders>
         <w:top w:val="single" w:sz="4" w:space="0" w:color="FAC396" w:themeColor="accent6" w:themeTint="90"/>
         <w:bottom w:val="single" w:sz="4" w:space="0" w:color="FAC396" w:themeColor="accent6" w:themeTint="90"/>
         <w:insideH w:val="single" w:sz="4" w:space="0" w:color="FAC396" w:themeColor="accent6" w:themeTint="90"/>
       </w:tblBorders>
-      <w:tblCellMar>
-        <w:top w:w="0" w:type="dxa"/>
-        <w:left w:w="108" w:type="dxa"/>
-        <w:bottom w:w="0" w:type="dxa"/>
-        <w:right w:w="108" w:type="dxa"/>
-      </w:tblCellMar>
     </w:tblPr>
     <w:tblStylePr w:type="firstRow">
       <w:rPr>
@@ -8823,19 +8351,12 @@
     <w:tblPr>
       <w:tblStyleRowBandSize w:val="1"/>
       <w:tblStyleColBandSize w:val="1"/>
-      <w:tblInd w:w="0" w:type="dxa"/>
       <w:tblBorders>
         <w:top w:val="single" w:sz="4" w:space="0" w:color="000000" w:themeColor="text1"/>
         <w:left w:val="single" w:sz="4" w:space="0" w:color="000000" w:themeColor="text1"/>
         <w:bottom w:val="single" w:sz="4" w:space="0" w:color="000000" w:themeColor="text1"/>
         <w:right w:val="single" w:sz="4" w:space="0" w:color="000000" w:themeColor="text1"/>
       </w:tblBorders>
-      <w:tblCellMar>
-        <w:top w:w="0" w:type="dxa"/>
-        <w:left w:w="108" w:type="dxa"/>
-        <w:bottom w:w="0" w:type="dxa"/>
-        <w:right w:w="108" w:type="dxa"/>
-      </w:tblCellMar>
     </w:tblPr>
     <w:tblStylePr w:type="firstRow">
       <w:rPr>
@@ -8906,19 +8427,12 @@
     <w:tblPr>
       <w:tblStyleRowBandSize w:val="1"/>
       <w:tblStyleColBandSize w:val="1"/>
-      <w:tblInd w:w="0" w:type="dxa"/>
       <w:tblBorders>
         <w:top w:val="single" w:sz="4" w:space="0" w:color="4F81BD" w:themeColor="accent1"/>
         <w:left w:val="single" w:sz="4" w:space="0" w:color="4F81BD" w:themeColor="accent1"/>
         <w:bottom w:val="single" w:sz="4" w:space="0" w:color="4F81BD" w:themeColor="accent1"/>
         <w:right w:val="single" w:sz="4" w:space="0" w:color="4F81BD" w:themeColor="accent1"/>
       </w:tblBorders>
-      <w:tblCellMar>
-        <w:top w:w="0" w:type="dxa"/>
-        <w:left w:w="108" w:type="dxa"/>
-        <w:bottom w:w="0" w:type="dxa"/>
-        <w:right w:w="108" w:type="dxa"/>
-      </w:tblCellMar>
     </w:tblPr>
     <w:tblStylePr w:type="firstRow">
       <w:rPr>
@@ -8989,19 +8503,12 @@
     <w:tblPr>
       <w:tblStyleRowBandSize w:val="1"/>
       <w:tblStyleColBandSize w:val="1"/>
-      <w:tblInd w:w="0" w:type="dxa"/>
       <w:tblBorders>
         <w:top w:val="single" w:sz="4" w:space="0" w:color="D99695" w:themeColor="accent2" w:themeTint="97"/>
         <w:left w:val="single" w:sz="4" w:space="0" w:color="D99695" w:themeColor="accent2" w:themeTint="97"/>
         <w:bottom w:val="single" w:sz="4" w:space="0" w:color="D99695" w:themeColor="accent2" w:themeTint="97"/>
         <w:right w:val="single" w:sz="4" w:space="0" w:color="D99695" w:themeColor="accent2" w:themeTint="97"/>
       </w:tblBorders>
-      <w:tblCellMar>
-        <w:top w:w="0" w:type="dxa"/>
-        <w:left w:w="108" w:type="dxa"/>
-        <w:bottom w:w="0" w:type="dxa"/>
-        <w:right w:w="108" w:type="dxa"/>
-      </w:tblCellMar>
     </w:tblPr>
     <w:tblStylePr w:type="firstRow">
       <w:rPr>
@@ -9072,19 +8579,12 @@
     <w:tblPr>
       <w:tblStyleRowBandSize w:val="1"/>
       <w:tblStyleColBandSize w:val="1"/>
-      <w:tblInd w:w="0" w:type="dxa"/>
       <w:tblBorders>
         <w:top w:val="single" w:sz="4" w:space="0" w:color="C3D69B" w:themeColor="accent3" w:themeTint="98"/>
         <w:left w:val="single" w:sz="4" w:space="0" w:color="C3D69B" w:themeColor="accent3" w:themeTint="98"/>
         <w:bottom w:val="single" w:sz="4" w:space="0" w:color="C3D69B" w:themeColor="accent3" w:themeTint="98"/>
         <w:right w:val="single" w:sz="4" w:space="0" w:color="C3D69B" w:themeColor="accent3" w:themeTint="98"/>
       </w:tblBorders>
-      <w:tblCellMar>
-        <w:top w:w="0" w:type="dxa"/>
-        <w:left w:w="108" w:type="dxa"/>
-        <w:bottom w:w="0" w:type="dxa"/>
-        <w:right w:w="108" w:type="dxa"/>
-      </w:tblCellMar>
     </w:tblPr>
     <w:tblStylePr w:type="firstRow">
       <w:rPr>
@@ -9155,19 +8655,12 @@
     <w:tblPr>
       <w:tblStyleRowBandSize w:val="1"/>
       <w:tblStyleColBandSize w:val="1"/>
-      <w:tblInd w:w="0" w:type="dxa"/>
       <w:tblBorders>
         <w:top w:val="single" w:sz="4" w:space="0" w:color="B2A1C6" w:themeColor="accent4" w:themeTint="9A"/>
         <w:left w:val="single" w:sz="4" w:space="0" w:color="B2A1C6" w:themeColor="accent4" w:themeTint="9A"/>
         <w:bottom w:val="single" w:sz="4" w:space="0" w:color="B2A1C6" w:themeColor="accent4" w:themeTint="9A"/>
         <w:right w:val="single" w:sz="4" w:space="0" w:color="B2A1C6" w:themeColor="accent4" w:themeTint="9A"/>
       </w:tblBorders>
-      <w:tblCellMar>
-        <w:top w:w="0" w:type="dxa"/>
-        <w:left w:w="108" w:type="dxa"/>
-        <w:bottom w:w="0" w:type="dxa"/>
-        <w:right w:w="108" w:type="dxa"/>
-      </w:tblCellMar>
     </w:tblPr>
     <w:tblStylePr w:type="firstRow">
       <w:rPr>
@@ -9238,19 +8731,12 @@
     <w:tblPr>
       <w:tblStyleRowBandSize w:val="1"/>
       <w:tblStyleColBandSize w:val="1"/>
-      <w:tblInd w:w="0" w:type="dxa"/>
       <w:tblBorders>
         <w:top w:val="single" w:sz="4" w:space="0" w:color="92CCDC" w:themeColor="accent5" w:themeTint="9A"/>
         <w:left w:val="single" w:sz="4" w:space="0" w:color="92CCDC" w:themeColor="accent5" w:themeTint="9A"/>
         <w:bottom w:val="single" w:sz="4" w:space="0" w:color="92CCDC" w:themeColor="accent5" w:themeTint="9A"/>
         <w:right w:val="single" w:sz="4" w:space="0" w:color="92CCDC" w:themeColor="accent5" w:themeTint="9A"/>
       </w:tblBorders>
-      <w:tblCellMar>
-        <w:top w:w="0" w:type="dxa"/>
-        <w:left w:w="108" w:type="dxa"/>
-        <w:bottom w:w="0" w:type="dxa"/>
-        <w:right w:w="108" w:type="dxa"/>
-      </w:tblCellMar>
     </w:tblPr>
     <w:tblStylePr w:type="firstRow">
       <w:rPr>
@@ -9321,19 +8807,12 @@
     <w:tblPr>
       <w:tblStyleRowBandSize w:val="1"/>
       <w:tblStyleColBandSize w:val="1"/>
-      <w:tblInd w:w="0" w:type="dxa"/>
       <w:tblBorders>
         <w:top w:val="single" w:sz="4" w:space="0" w:color="FAC090" w:themeColor="accent6" w:themeTint="98"/>
         <w:left w:val="single" w:sz="4" w:space="0" w:color="FAC090" w:themeColor="accent6" w:themeTint="98"/>
         <w:bottom w:val="single" w:sz="4" w:space="0" w:color="FAC090" w:themeColor="accent6" w:themeTint="98"/>
         <w:right w:val="single" w:sz="4" w:space="0" w:color="FAC090" w:themeColor="accent6" w:themeTint="98"/>
       </w:tblBorders>
-      <w:tblCellMar>
-        <w:top w:w="0" w:type="dxa"/>
-        <w:left w:w="108" w:type="dxa"/>
-        <w:bottom w:w="0" w:type="dxa"/>
-        <w:right w:w="108" w:type="dxa"/>
-      </w:tblCellMar>
     </w:tblPr>
     <w:tblStylePr w:type="firstRow">
       <w:rPr>
@@ -9404,7 +8883,6 @@
     <w:tblPr>
       <w:tblStyleRowBandSize w:val="1"/>
       <w:tblStyleColBandSize w:val="1"/>
-      <w:tblInd w:w="0" w:type="dxa"/>
       <w:tblBorders>
         <w:top w:val="single" w:sz="4" w:space="0" w:color="000000" w:themeColor="text1"/>
         <w:left w:val="single" w:sz="4" w:space="0" w:color="000000" w:themeColor="text1"/>
@@ -9412,12 +8890,6 @@
         <w:right w:val="single" w:sz="4" w:space="0" w:color="000000" w:themeColor="text1"/>
         <w:insideH w:val="single" w:sz="4" w:space="0" w:color="000000" w:themeColor="text1"/>
       </w:tblBorders>
-      <w:tblCellMar>
-        <w:top w:w="0" w:type="dxa"/>
-        <w:left w:w="108" w:type="dxa"/>
-        <w:bottom w:w="0" w:type="dxa"/>
-        <w:right w:w="108" w:type="dxa"/>
-      </w:tblCellMar>
     </w:tblPr>
     <w:tblStylePr w:type="firstRow">
       <w:rPr>
@@ -9482,7 +8954,6 @@
     <w:tblPr>
       <w:tblStyleRowBandSize w:val="1"/>
       <w:tblStyleColBandSize w:val="1"/>
-      <w:tblInd w:w="0" w:type="dxa"/>
       <w:tblBorders>
         <w:top w:val="single" w:sz="4" w:space="0" w:color="9BB7D9" w:themeColor="accent1" w:themeTint="90"/>
         <w:left w:val="single" w:sz="4" w:space="0" w:color="9BB7D9" w:themeColor="accent1" w:themeTint="90"/>
@@ -9490,12 +8961,6 @@
         <w:right w:val="single" w:sz="4" w:space="0" w:color="9BB7D9" w:themeColor="accent1" w:themeTint="90"/>
         <w:insideH w:val="single" w:sz="4" w:space="0" w:color="9BB7D9" w:themeColor="accent1" w:themeTint="90"/>
       </w:tblBorders>
-      <w:tblCellMar>
-        <w:top w:w="0" w:type="dxa"/>
-        <w:left w:w="108" w:type="dxa"/>
-        <w:bottom w:w="0" w:type="dxa"/>
-        <w:right w:w="108" w:type="dxa"/>
-      </w:tblCellMar>
     </w:tblPr>
     <w:tblStylePr w:type="firstRow">
       <w:rPr>
@@ -9560,7 +9025,6 @@
     <w:tblPr>
       <w:tblStyleRowBandSize w:val="1"/>
       <w:tblStyleColBandSize w:val="1"/>
-      <w:tblInd w:w="0" w:type="dxa"/>
       <w:tblBorders>
         <w:top w:val="single" w:sz="4" w:space="0" w:color="DB9B9A" w:themeColor="accent2" w:themeTint="90"/>
         <w:left w:val="single" w:sz="4" w:space="0" w:color="DB9B9A" w:themeColor="accent2" w:themeTint="90"/>
@@ -9568,12 +9032,6 @@
         <w:right w:val="single" w:sz="4" w:space="0" w:color="DB9B9A" w:themeColor="accent2" w:themeTint="90"/>
         <w:insideH w:val="single" w:sz="4" w:space="0" w:color="DB9B9A" w:themeColor="accent2" w:themeTint="90"/>
       </w:tblBorders>
-      <w:tblCellMar>
-        <w:top w:w="0" w:type="dxa"/>
-        <w:left w:w="108" w:type="dxa"/>
-        <w:bottom w:w="0" w:type="dxa"/>
-        <w:right w:w="108" w:type="dxa"/>
-      </w:tblCellMar>
     </w:tblPr>
     <w:tblStylePr w:type="firstRow">
       <w:rPr>
@@ -9638,7 +9096,6 @@
     <w:tblPr>
       <w:tblStyleRowBandSize w:val="1"/>
       <w:tblStyleColBandSize w:val="1"/>
-      <w:tblInd w:w="0" w:type="dxa"/>
       <w:tblBorders>
         <w:top w:val="single" w:sz="4" w:space="0" w:color="C6D8A1" w:themeColor="accent3" w:themeTint="90"/>
         <w:left w:val="single" w:sz="4" w:space="0" w:color="C6D8A1" w:themeColor="accent3" w:themeTint="90"/>
@@ -9646,12 +9103,6 @@
         <w:right w:val="single" w:sz="4" w:space="0" w:color="C6D8A1" w:themeColor="accent3" w:themeTint="90"/>
         <w:insideH w:val="single" w:sz="4" w:space="0" w:color="C6D8A1" w:themeColor="accent3" w:themeTint="90"/>
       </w:tblBorders>
-      <w:tblCellMar>
-        <w:top w:w="0" w:type="dxa"/>
-        <w:left w:w="108" w:type="dxa"/>
-        <w:bottom w:w="0" w:type="dxa"/>
-        <w:right w:w="108" w:type="dxa"/>
-      </w:tblCellMar>
     </w:tblPr>
     <w:tblStylePr w:type="firstRow">
       <w:rPr>
@@ -9716,7 +9167,6 @@
     <w:tblPr>
       <w:tblStyleRowBandSize w:val="1"/>
       <w:tblStyleColBandSize w:val="1"/>
-      <w:tblInd w:w="0" w:type="dxa"/>
       <w:tblBorders>
         <w:top w:val="single" w:sz="4" w:space="0" w:color="B7A7CA" w:themeColor="accent4" w:themeTint="90"/>
         <w:left w:val="single" w:sz="4" w:space="0" w:color="B7A7CA" w:themeColor="accent4" w:themeTint="90"/>
@@ -9724,12 +9174,6 @@
         <w:right w:val="single" w:sz="4" w:space="0" w:color="B7A7CA" w:themeColor="accent4" w:themeTint="90"/>
         <w:insideH w:val="single" w:sz="4" w:space="0" w:color="B7A7CA" w:themeColor="accent4" w:themeTint="90"/>
       </w:tblBorders>
-      <w:tblCellMar>
-        <w:top w:w="0" w:type="dxa"/>
-        <w:left w:w="108" w:type="dxa"/>
-        <w:bottom w:w="0" w:type="dxa"/>
-        <w:right w:w="108" w:type="dxa"/>
-      </w:tblCellMar>
     </w:tblPr>
     <w:tblStylePr w:type="firstRow">
       <w:rPr>
@@ -9794,7 +9238,6 @@
     <w:tblPr>
       <w:tblStyleRowBandSize w:val="1"/>
       <w:tblStyleColBandSize w:val="1"/>
-      <w:tblInd w:w="0" w:type="dxa"/>
       <w:tblBorders>
         <w:top w:val="single" w:sz="4" w:space="0" w:color="99D0DE" w:themeColor="accent5" w:themeTint="90"/>
         <w:left w:val="single" w:sz="4" w:space="0" w:color="99D0DE" w:themeColor="accent5" w:themeTint="90"/>
@@ -9802,12 +9245,6 @@
         <w:right w:val="single" w:sz="4" w:space="0" w:color="99D0DE" w:themeColor="accent5" w:themeTint="90"/>
         <w:insideH w:val="single" w:sz="4" w:space="0" w:color="99D0DE" w:themeColor="accent5" w:themeTint="90"/>
       </w:tblBorders>
-      <w:tblCellMar>
-        <w:top w:w="0" w:type="dxa"/>
-        <w:left w:w="108" w:type="dxa"/>
-        <w:bottom w:w="0" w:type="dxa"/>
-        <w:right w:w="108" w:type="dxa"/>
-      </w:tblCellMar>
     </w:tblPr>
     <w:tblStylePr w:type="firstRow">
       <w:rPr>
@@ -9872,7 +9309,6 @@
     <w:tblPr>
       <w:tblStyleRowBandSize w:val="1"/>
       <w:tblStyleColBandSize w:val="1"/>
-      <w:tblInd w:w="0" w:type="dxa"/>
       <w:tblBorders>
         <w:top w:val="single" w:sz="4" w:space="0" w:color="FAC396" w:themeColor="accent6" w:themeTint="90"/>
         <w:left w:val="single" w:sz="4" w:space="0" w:color="FAC396" w:themeColor="accent6" w:themeTint="90"/>
@@ -9880,12 +9316,6 @@
         <w:right w:val="single" w:sz="4" w:space="0" w:color="FAC396" w:themeColor="accent6" w:themeTint="90"/>
         <w:insideH w:val="single" w:sz="4" w:space="0" w:color="FAC396" w:themeColor="accent6" w:themeTint="90"/>
       </w:tblBorders>
-      <w:tblCellMar>
-        <w:top w:w="0" w:type="dxa"/>
-        <w:left w:w="108" w:type="dxa"/>
-        <w:bottom w:w="0" w:type="dxa"/>
-        <w:right w:w="108" w:type="dxa"/>
-      </w:tblCellMar>
     </w:tblPr>
     <w:tblStylePr w:type="firstRow">
       <w:rPr>
@@ -9950,7 +9380,6 @@
     <w:tblPr>
       <w:tblStyleRowBandSize w:val="1"/>
       <w:tblStyleColBandSize w:val="1"/>
-      <w:tblInd w:w="0" w:type="dxa"/>
       <w:tblBorders>
         <w:top w:val="single" w:sz="32" w:space="0" w:color="7F7F7F" w:themeColor="text1" w:themeTint="80"/>
         <w:left w:val="single" w:sz="32" w:space="0" w:color="7F7F7F" w:themeColor="text1" w:themeTint="80"/>
@@ -9958,12 +9387,6 @@
         <w:right w:val="single" w:sz="32" w:space="0" w:color="7F7F7F" w:themeColor="text1" w:themeTint="80"/>
       </w:tblBorders>
       <w:shd w:val="clear" w:color="7F7F7F" w:themeColor="text1" w:themeTint="80" w:fill="7F7F7F" w:themeFill="text1" w:themeFillTint="80"/>
-      <w:tblCellMar>
-        <w:top w:w="0" w:type="dxa"/>
-        <w:left w:w="108" w:type="dxa"/>
-        <w:bottom w:w="0" w:type="dxa"/>
-        <w:right w:w="108" w:type="dxa"/>
-      </w:tblCellMar>
     </w:tblPr>
     <w:tblStylePr w:type="firstRow">
       <w:rPr>
@@ -10063,7 +9486,6 @@
     <w:tblPr>
       <w:tblStyleRowBandSize w:val="1"/>
       <w:tblStyleColBandSize w:val="1"/>
-      <w:tblInd w:w="0" w:type="dxa"/>
       <w:tblBorders>
         <w:top w:val="single" w:sz="32" w:space="0" w:color="4F81BD" w:themeColor="accent1"/>
         <w:left w:val="single" w:sz="32" w:space="0" w:color="4F81BD" w:themeColor="accent1"/>
@@ -10071,12 +9493,6 @@
         <w:right w:val="single" w:sz="32" w:space="0" w:color="4F81BD" w:themeColor="accent1"/>
       </w:tblBorders>
       <w:shd w:val="clear" w:color="4F81BD" w:themeColor="accent1" w:fill="4F81BD" w:themeFill="accent1"/>
-      <w:tblCellMar>
-        <w:top w:w="0" w:type="dxa"/>
-        <w:left w:w="108" w:type="dxa"/>
-        <w:bottom w:w="0" w:type="dxa"/>
-        <w:right w:w="108" w:type="dxa"/>
-      </w:tblCellMar>
     </w:tblPr>
     <w:tblStylePr w:type="firstRow">
       <w:rPr>
@@ -10176,7 +9592,6 @@
     <w:tblPr>
       <w:tblStyleRowBandSize w:val="1"/>
       <w:tblStyleColBandSize w:val="1"/>
-      <w:tblInd w:w="0" w:type="dxa"/>
       <w:tblBorders>
         <w:top w:val="single" w:sz="32" w:space="0" w:color="D99695" w:themeColor="accent2" w:themeTint="97"/>
         <w:left w:val="single" w:sz="32" w:space="0" w:color="D99695" w:themeColor="accent2" w:themeTint="97"/>
@@ -10184,12 +9599,6 @@
         <w:right w:val="single" w:sz="32" w:space="0" w:color="D99695" w:themeColor="accent2" w:themeTint="97"/>
       </w:tblBorders>
       <w:shd w:val="clear" w:color="D99695" w:themeColor="accent2" w:themeTint="97" w:fill="D99695" w:themeFill="accent2" w:themeFillTint="97"/>
-      <w:tblCellMar>
-        <w:top w:w="0" w:type="dxa"/>
-        <w:left w:w="108" w:type="dxa"/>
-        <w:bottom w:w="0" w:type="dxa"/>
-        <w:right w:w="108" w:type="dxa"/>
-      </w:tblCellMar>
     </w:tblPr>
     <w:tblStylePr w:type="firstRow">
       <w:rPr>
@@ -10289,7 +9698,6 @@
     <w:tblPr>
       <w:tblStyleRowBandSize w:val="1"/>
       <w:tblStyleColBandSize w:val="1"/>
-      <w:tblInd w:w="0" w:type="dxa"/>
       <w:tblBorders>
         <w:top w:val="single" w:sz="32" w:space="0" w:color="C3D69B" w:themeColor="accent3" w:themeTint="98"/>
         <w:left w:val="single" w:sz="32" w:space="0" w:color="C3D69B" w:themeColor="accent3" w:themeTint="98"/>
@@ -10297,12 +9705,6 @@
         <w:right w:val="single" w:sz="32" w:space="0" w:color="C3D69B" w:themeColor="accent3" w:themeTint="98"/>
       </w:tblBorders>
       <w:shd w:val="clear" w:color="C3D69B" w:themeColor="accent3" w:themeTint="98" w:fill="C3D69B" w:themeFill="accent3" w:themeFillTint="98"/>
-      <w:tblCellMar>
-        <w:top w:w="0" w:type="dxa"/>
-        <w:left w:w="108" w:type="dxa"/>
-        <w:bottom w:w="0" w:type="dxa"/>
-        <w:right w:w="108" w:type="dxa"/>
-      </w:tblCellMar>
     </w:tblPr>
     <w:tblStylePr w:type="firstRow">
       <w:rPr>
@@ -10402,7 +9804,6 @@
     <w:tblPr>
       <w:tblStyleRowBandSize w:val="1"/>
       <w:tblStyleColBandSize w:val="1"/>
-      <w:tblInd w:w="0" w:type="dxa"/>
       <w:tblBorders>
         <w:top w:val="single" w:sz="32" w:space="0" w:color="B2A1C6" w:themeColor="accent4" w:themeTint="9A"/>
         <w:left w:val="single" w:sz="32" w:space="0" w:color="B2A1C6" w:themeColor="accent4" w:themeTint="9A"/>
@@ -10410,12 +9811,6 @@
         <w:right w:val="single" w:sz="32" w:space="0" w:color="B2A1C6" w:themeColor="accent4" w:themeTint="9A"/>
       </w:tblBorders>
       <w:shd w:val="clear" w:color="B2A1C6" w:themeColor="accent4" w:themeTint="9A" w:fill="B2A1C6" w:themeFill="accent4" w:themeFillTint="9A"/>
-      <w:tblCellMar>
-        <w:top w:w="0" w:type="dxa"/>
-        <w:left w:w="108" w:type="dxa"/>
-        <w:bottom w:w="0" w:type="dxa"/>
-        <w:right w:w="108" w:type="dxa"/>
-      </w:tblCellMar>
     </w:tblPr>
     <w:tblStylePr w:type="firstRow">
       <w:rPr>
@@ -10515,7 +9910,6 @@
     <w:tblPr>
       <w:tblStyleRowBandSize w:val="1"/>
       <w:tblStyleColBandSize w:val="1"/>
-      <w:tblInd w:w="0" w:type="dxa"/>
       <w:tblBorders>
         <w:top w:val="single" w:sz="32" w:space="0" w:color="92CCDC" w:themeColor="accent5" w:themeTint="9A"/>
         <w:left w:val="single" w:sz="32" w:space="0" w:color="92CCDC" w:themeColor="accent5" w:themeTint="9A"/>
@@ -10523,12 +9917,6 @@
         <w:right w:val="single" w:sz="32" w:space="0" w:color="92CCDC" w:themeColor="accent5" w:themeTint="9A"/>
       </w:tblBorders>
       <w:shd w:val="clear" w:color="92CCDC" w:themeColor="accent5" w:themeTint="9A" w:fill="92CCDC" w:themeFill="accent5" w:themeFillTint="9A"/>
-      <w:tblCellMar>
-        <w:top w:w="0" w:type="dxa"/>
-        <w:left w:w="108" w:type="dxa"/>
-        <w:bottom w:w="0" w:type="dxa"/>
-        <w:right w:w="108" w:type="dxa"/>
-      </w:tblCellMar>
     </w:tblPr>
     <w:tblStylePr w:type="firstRow">
       <w:rPr>
@@ -10628,7 +10016,6 @@
     <w:tblPr>
       <w:tblStyleRowBandSize w:val="1"/>
       <w:tblStyleColBandSize w:val="1"/>
-      <w:tblInd w:w="0" w:type="dxa"/>
       <w:tblBorders>
         <w:top w:val="single" w:sz="32" w:space="0" w:color="FAC090" w:themeColor="accent6" w:themeTint="98"/>
         <w:left w:val="single" w:sz="32" w:space="0" w:color="FAC090" w:themeColor="accent6" w:themeTint="98"/>
@@ -10636,12 +10023,6 @@
         <w:right w:val="single" w:sz="32" w:space="0" w:color="FAC090" w:themeColor="accent6" w:themeTint="98"/>
       </w:tblBorders>
       <w:shd w:val="clear" w:color="FAC090" w:themeColor="accent6" w:themeTint="98" w:fill="FAC090" w:themeFill="accent6" w:themeFillTint="98"/>
-      <w:tblCellMar>
-        <w:top w:w="0" w:type="dxa"/>
-        <w:left w:w="108" w:type="dxa"/>
-        <w:bottom w:w="0" w:type="dxa"/>
-        <w:right w:w="108" w:type="dxa"/>
-      </w:tblCellMar>
     </w:tblPr>
     <w:tblStylePr w:type="firstRow">
       <w:rPr>
@@ -10741,17 +10122,10 @@
     <w:tblPr>
       <w:tblStyleRowBandSize w:val="1"/>
       <w:tblStyleColBandSize w:val="1"/>
-      <w:tblInd w:w="0" w:type="dxa"/>
       <w:tblBorders>
         <w:top w:val="single" w:sz="4" w:space="0" w:color="7F7F7F" w:themeColor="text1" w:themeTint="80"/>
         <w:bottom w:val="single" w:sz="4" w:space="0" w:color="7F7F7F" w:themeColor="text1" w:themeTint="80"/>
       </w:tblBorders>
-      <w:tblCellMar>
-        <w:top w:w="0" w:type="dxa"/>
-        <w:left w:w="108" w:type="dxa"/>
-        <w:bottom w:w="0" w:type="dxa"/>
-        <w:right w:w="108" w:type="dxa"/>
-      </w:tblCellMar>
     </w:tblPr>
     <w:tblStylePr w:type="firstRow">
       <w:rPr>
@@ -10824,17 +10198,10 @@
     <w:tblPr>
       <w:tblStyleRowBandSize w:val="1"/>
       <w:tblStyleColBandSize w:val="1"/>
-      <w:tblInd w:w="0" w:type="dxa"/>
       <w:tblBorders>
         <w:top w:val="single" w:sz="4" w:space="0" w:color="4F81BD" w:themeColor="accent1"/>
         <w:bottom w:val="single" w:sz="4" w:space="0" w:color="4F81BD" w:themeColor="accent1"/>
       </w:tblBorders>
-      <w:tblCellMar>
-        <w:top w:w="0" w:type="dxa"/>
-        <w:left w:w="108" w:type="dxa"/>
-        <w:bottom w:w="0" w:type="dxa"/>
-        <w:right w:w="108" w:type="dxa"/>
-      </w:tblCellMar>
     </w:tblPr>
     <w:tblStylePr w:type="firstRow">
       <w:rPr>
@@ -10907,17 +10274,10 @@
     <w:tblPr>
       <w:tblStyleRowBandSize w:val="1"/>
       <w:tblStyleColBandSize w:val="1"/>
-      <w:tblInd w:w="0" w:type="dxa"/>
       <w:tblBorders>
         <w:top w:val="single" w:sz="4" w:space="0" w:color="D99695" w:themeColor="accent2" w:themeTint="97"/>
         <w:bottom w:val="single" w:sz="4" w:space="0" w:color="D99695" w:themeColor="accent2" w:themeTint="97"/>
       </w:tblBorders>
-      <w:tblCellMar>
-        <w:top w:w="0" w:type="dxa"/>
-        <w:left w:w="108" w:type="dxa"/>
-        <w:bottom w:w="0" w:type="dxa"/>
-        <w:right w:w="108" w:type="dxa"/>
-      </w:tblCellMar>
     </w:tblPr>
     <w:tblStylePr w:type="firstRow">
       <w:rPr>
@@ -10990,17 +10350,10 @@
     <w:tblPr>
       <w:tblStyleRowBandSize w:val="1"/>
       <w:tblStyleColBandSize w:val="1"/>
-      <w:tblInd w:w="0" w:type="dxa"/>
       <w:tblBorders>
         <w:top w:val="single" w:sz="4" w:space="0" w:color="C3D69B" w:themeColor="accent3" w:themeTint="98"/>
         <w:bottom w:val="single" w:sz="4" w:space="0" w:color="C3D69B" w:themeColor="accent3" w:themeTint="98"/>
       </w:tblBorders>
-      <w:tblCellMar>
-        <w:top w:w="0" w:type="dxa"/>
-        <w:left w:w="108" w:type="dxa"/>
-        <w:bottom w:w="0" w:type="dxa"/>
-        <w:right w:w="108" w:type="dxa"/>
-      </w:tblCellMar>
     </w:tblPr>
     <w:tblStylePr w:type="firstRow">
       <w:rPr>
@@ -11073,17 +10426,10 @@
     <w:tblPr>
       <w:tblStyleRowBandSize w:val="1"/>
       <w:tblStyleColBandSize w:val="1"/>
-      <w:tblInd w:w="0" w:type="dxa"/>
       <w:tblBorders>
         <w:top w:val="single" w:sz="4" w:space="0" w:color="B2A1C6" w:themeColor="accent4" w:themeTint="9A"/>
         <w:bottom w:val="single" w:sz="4" w:space="0" w:color="B2A1C6" w:themeColor="accent4" w:themeTint="9A"/>
       </w:tblBorders>
-      <w:tblCellMar>
-        <w:top w:w="0" w:type="dxa"/>
-        <w:left w:w="108" w:type="dxa"/>
-        <w:bottom w:w="0" w:type="dxa"/>
-        <w:right w:w="108" w:type="dxa"/>
-      </w:tblCellMar>
     </w:tblPr>
     <w:tblStylePr w:type="firstRow">
       <w:rPr>
@@ -11156,17 +10502,10 @@
     <w:tblPr>
       <w:tblStyleRowBandSize w:val="1"/>
       <w:tblStyleColBandSize w:val="1"/>
-      <w:tblInd w:w="0" w:type="dxa"/>
       <w:tblBorders>
         <w:top w:val="single" w:sz="4" w:space="0" w:color="92CCDC" w:themeColor="accent5" w:themeTint="9A"/>
         <w:bottom w:val="single" w:sz="4" w:space="0" w:color="92CCDC" w:themeColor="accent5" w:themeTint="9A"/>
       </w:tblBorders>
-      <w:tblCellMar>
-        <w:top w:w="0" w:type="dxa"/>
-        <w:left w:w="108" w:type="dxa"/>
-        <w:bottom w:w="0" w:type="dxa"/>
-        <w:right w:w="108" w:type="dxa"/>
-      </w:tblCellMar>
     </w:tblPr>
     <w:tblStylePr w:type="firstRow">
       <w:rPr>
@@ -11239,17 +10578,10 @@
     <w:tblPr>
       <w:tblStyleRowBandSize w:val="1"/>
       <w:tblStyleColBandSize w:val="1"/>
-      <w:tblInd w:w="0" w:type="dxa"/>
       <w:tblBorders>
         <w:top w:val="single" w:sz="4" w:space="0" w:color="FAC090" w:themeColor="accent6" w:themeTint="98"/>
         <w:bottom w:val="single" w:sz="4" w:space="0" w:color="FAC090" w:themeColor="accent6" w:themeTint="98"/>
       </w:tblBorders>
-      <w:tblCellMar>
-        <w:top w:w="0" w:type="dxa"/>
-        <w:left w:w="108" w:type="dxa"/>
-        <w:bottom w:w="0" w:type="dxa"/>
-        <w:right w:w="108" w:type="dxa"/>
-      </w:tblCellMar>
     </w:tblPr>
     <w:tblStylePr w:type="firstRow">
       <w:rPr>
@@ -11322,16 +10654,9 @@
     <w:tblPr>
       <w:tblStyleRowBandSize w:val="1"/>
       <w:tblStyleColBandSize w:val="1"/>
-      <w:tblInd w:w="0" w:type="dxa"/>
       <w:tblBorders>
         <w:right w:val="single" w:sz="4" w:space="0" w:color="7F7F7F" w:themeColor="text1" w:themeTint="80"/>
       </w:tblBorders>
-      <w:tblCellMar>
-        <w:top w:w="0" w:type="dxa"/>
-        <w:left w:w="108" w:type="dxa"/>
-        <w:bottom w:w="0" w:type="dxa"/>
-        <w:right w:w="108" w:type="dxa"/>
-      </w:tblCellMar>
     </w:tblPr>
     <w:tblStylePr w:type="firstRow">
       <w:rPr>
@@ -11443,16 +10768,9 @@
     <w:tblPr>
       <w:tblStyleRowBandSize w:val="1"/>
       <w:tblStyleColBandSize w:val="1"/>
-      <w:tblInd w:w="0" w:type="dxa"/>
       <w:tblBorders>
         <w:right w:val="single" w:sz="4" w:space="0" w:color="4F81BD" w:themeColor="accent1"/>
       </w:tblBorders>
-      <w:tblCellMar>
-        <w:top w:w="0" w:type="dxa"/>
-        <w:left w:w="108" w:type="dxa"/>
-        <w:bottom w:w="0" w:type="dxa"/>
-        <w:right w:w="108" w:type="dxa"/>
-      </w:tblCellMar>
     </w:tblPr>
     <w:tblStylePr w:type="firstRow">
       <w:rPr>
@@ -11564,16 +10882,9 @@
     <w:tblPr>
       <w:tblStyleRowBandSize w:val="1"/>
       <w:tblStyleColBandSize w:val="1"/>
-      <w:tblInd w:w="0" w:type="dxa"/>
       <w:tblBorders>
         <w:right w:val="single" w:sz="4" w:space="0" w:color="D99695" w:themeColor="accent2" w:themeTint="97"/>
       </w:tblBorders>
-      <w:tblCellMar>
-        <w:top w:w="0" w:type="dxa"/>
-        <w:left w:w="108" w:type="dxa"/>
-        <w:bottom w:w="0" w:type="dxa"/>
-        <w:right w:w="108" w:type="dxa"/>
-      </w:tblCellMar>
     </w:tblPr>
     <w:tblStylePr w:type="firstRow">
       <w:rPr>
@@ -11685,16 +10996,9 @@
     <w:tblPr>
       <w:tblStyleRowBandSize w:val="1"/>
       <w:tblStyleColBandSize w:val="1"/>
-      <w:tblInd w:w="0" w:type="dxa"/>
       <w:tblBorders>
         <w:right w:val="single" w:sz="4" w:space="0" w:color="C3D69B" w:themeColor="accent3" w:themeTint="98"/>
       </w:tblBorders>
-      <w:tblCellMar>
-        <w:top w:w="0" w:type="dxa"/>
-        <w:left w:w="108" w:type="dxa"/>
-        <w:bottom w:w="0" w:type="dxa"/>
-        <w:right w:w="108" w:type="dxa"/>
-      </w:tblCellMar>
     </w:tblPr>
     <w:tblStylePr w:type="firstRow">
       <w:rPr>
@@ -11806,16 +11110,9 @@
     <w:tblPr>
       <w:tblStyleRowBandSize w:val="1"/>
       <w:tblStyleColBandSize w:val="1"/>
-      <w:tblInd w:w="0" w:type="dxa"/>
       <w:tblBorders>
         <w:right w:val="single" w:sz="4" w:space="0" w:color="B2A1C6" w:themeColor="accent4" w:themeTint="9A"/>
       </w:tblBorders>
-      <w:tblCellMar>
-        <w:top w:w="0" w:type="dxa"/>
-        <w:left w:w="108" w:type="dxa"/>
-        <w:bottom w:w="0" w:type="dxa"/>
-        <w:right w:w="108" w:type="dxa"/>
-      </w:tblCellMar>
     </w:tblPr>
     <w:tblStylePr w:type="firstRow">
       <w:rPr>
@@ -11927,16 +11224,9 @@
     <w:tblPr>
       <w:tblStyleRowBandSize w:val="1"/>
       <w:tblStyleColBandSize w:val="1"/>
-      <w:tblInd w:w="0" w:type="dxa"/>
       <w:tblBorders>
         <w:right w:val="single" w:sz="4" w:space="0" w:color="92CCDC" w:themeColor="accent5" w:themeTint="9A"/>
       </w:tblBorders>
-      <w:tblCellMar>
-        <w:top w:w="0" w:type="dxa"/>
-        <w:left w:w="108" w:type="dxa"/>
-        <w:bottom w:w="0" w:type="dxa"/>
-        <w:right w:w="108" w:type="dxa"/>
-      </w:tblCellMar>
     </w:tblPr>
     <w:tblStylePr w:type="firstRow">
       <w:rPr>
@@ -12048,16 +11338,9 @@
     <w:tblPr>
       <w:tblStyleRowBandSize w:val="1"/>
       <w:tblStyleColBandSize w:val="1"/>
-      <w:tblInd w:w="0" w:type="dxa"/>
       <w:tblBorders>
         <w:right w:val="single" w:sz="4" w:space="0" w:color="FAC090" w:themeColor="accent6" w:themeTint="98"/>
       </w:tblBorders>
-      <w:tblCellMar>
-        <w:top w:w="0" w:type="dxa"/>
-        <w:left w:w="108" w:type="dxa"/>
-        <w:bottom w:w="0" w:type="dxa"/>
-        <w:right w:w="108" w:type="dxa"/>
-      </w:tblCellMar>
     </w:tblPr>
     <w:tblStylePr w:type="firstRow">
       <w:rPr>
@@ -12174,13 +11457,6 @@
     <w:tblPr>
       <w:tblStyleRowBandSize w:val="1"/>
       <w:tblStyleColBandSize w:val="1"/>
-      <w:tblInd w:w="0" w:type="dxa"/>
-      <w:tblCellMar>
-        <w:top w:w="0" w:type="dxa"/>
-        <w:left w:w="108" w:type="dxa"/>
-        <w:bottom w:w="0" w:type="dxa"/>
-        <w:right w:w="108" w:type="dxa"/>
-      </w:tblCellMar>
     </w:tblPr>
     <w:tblStylePr w:type="firstRow">
       <w:rPr>
@@ -12278,13 +11554,6 @@
     <w:tblPr>
       <w:tblStyleRowBandSize w:val="1"/>
       <w:tblStyleColBandSize w:val="1"/>
-      <w:tblInd w:w="0" w:type="dxa"/>
-      <w:tblCellMar>
-        <w:top w:w="0" w:type="dxa"/>
-        <w:left w:w="108" w:type="dxa"/>
-        <w:bottom w:w="0" w:type="dxa"/>
-        <w:right w:w="108" w:type="dxa"/>
-      </w:tblCellMar>
     </w:tblPr>
     <w:tblStylePr w:type="firstRow">
       <w:rPr>
@@ -12382,13 +11651,6 @@
     <w:tblPr>
       <w:tblStyleRowBandSize w:val="1"/>
       <w:tblStyleColBandSize w:val="1"/>
-      <w:tblInd w:w="0" w:type="dxa"/>
-      <w:tblCellMar>
-        <w:top w:w="0" w:type="dxa"/>
-        <w:left w:w="108" w:type="dxa"/>
-        <w:bottom w:w="0" w:type="dxa"/>
-        <w:right w:w="108" w:type="dxa"/>
-      </w:tblCellMar>
     </w:tblPr>
     <w:tblStylePr w:type="firstRow">
       <w:rPr>
@@ -12486,13 +11748,6 @@
     <w:tblPr>
       <w:tblStyleRowBandSize w:val="1"/>
       <w:tblStyleColBandSize w:val="1"/>
-      <w:tblInd w:w="0" w:type="dxa"/>
-      <w:tblCellMar>
-        <w:top w:w="0" w:type="dxa"/>
-        <w:left w:w="108" w:type="dxa"/>
-        <w:bottom w:w="0" w:type="dxa"/>
-        <w:right w:w="108" w:type="dxa"/>
-      </w:tblCellMar>
     </w:tblPr>
     <w:tblStylePr w:type="firstRow">
       <w:rPr>
@@ -12590,13 +11845,6 @@
     <w:tblPr>
       <w:tblStyleRowBandSize w:val="1"/>
       <w:tblStyleColBandSize w:val="1"/>
-      <w:tblInd w:w="0" w:type="dxa"/>
-      <w:tblCellMar>
-        <w:top w:w="0" w:type="dxa"/>
-        <w:left w:w="108" w:type="dxa"/>
-        <w:bottom w:w="0" w:type="dxa"/>
-        <w:right w:w="108" w:type="dxa"/>
-      </w:tblCellMar>
     </w:tblPr>
     <w:tblStylePr w:type="firstRow">
       <w:rPr>
@@ -12694,13 +11942,6 @@
     <w:tblPr>
       <w:tblStyleRowBandSize w:val="1"/>
       <w:tblStyleColBandSize w:val="1"/>
-      <w:tblInd w:w="0" w:type="dxa"/>
-      <w:tblCellMar>
-        <w:top w:w="0" w:type="dxa"/>
-        <w:left w:w="108" w:type="dxa"/>
-        <w:bottom w:w="0" w:type="dxa"/>
-        <w:right w:w="108" w:type="dxa"/>
-      </w:tblCellMar>
     </w:tblPr>
     <w:tblStylePr w:type="firstRow">
       <w:rPr>
@@ -12798,13 +12039,6 @@
     <w:tblPr>
       <w:tblStyleRowBandSize w:val="1"/>
       <w:tblStyleColBandSize w:val="1"/>
-      <w:tblInd w:w="0" w:type="dxa"/>
-      <w:tblCellMar>
-        <w:top w:w="0" w:type="dxa"/>
-        <w:left w:w="108" w:type="dxa"/>
-        <w:bottom w:w="0" w:type="dxa"/>
-        <w:right w:w="108" w:type="dxa"/>
-      </w:tblCellMar>
     </w:tblPr>
     <w:tblStylePr w:type="firstRow">
       <w:rPr>
@@ -12902,7 +12136,6 @@
     <w:tblPr>
       <w:tblStyleRowBandSize w:val="1"/>
       <w:tblStyleColBandSize w:val="1"/>
-      <w:tblInd w:w="0" w:type="dxa"/>
       <w:tblBorders>
         <w:top w:val="single" w:sz="4" w:space="0" w:color="595959" w:themeColor="text1" w:themeTint="A6"/>
         <w:left w:val="single" w:sz="4" w:space="0" w:color="595959" w:themeColor="text1" w:themeTint="A6"/>
@@ -12911,12 +12144,6 @@
         <w:insideH w:val="single" w:sz="4" w:space="0" w:color="595959" w:themeColor="text1" w:themeTint="A6"/>
         <w:insideV w:val="single" w:sz="4" w:space="0" w:color="595959" w:themeColor="text1" w:themeTint="A6"/>
       </w:tblBorders>
-      <w:tblCellMar>
-        <w:top w:w="0" w:type="dxa"/>
-        <w:left w:w="108" w:type="dxa"/>
-        <w:bottom w:w="0" w:type="dxa"/>
-        <w:right w:w="108" w:type="dxa"/>
-      </w:tblCellMar>
     </w:tblPr>
     <w:tblStylePr w:type="firstRow">
       <w:rPr>
@@ -13014,7 +12241,6 @@
     <w:tblPr>
       <w:tblStyleRowBandSize w:val="1"/>
       <w:tblStyleColBandSize w:val="1"/>
-      <w:tblInd w:w="0" w:type="dxa"/>
       <w:tblBorders>
         <w:top w:val="single" w:sz="4" w:space="0" w:color="2A4A71" w:themeColor="accent1" w:themeShade="95"/>
         <w:left w:val="single" w:sz="4" w:space="0" w:color="2A4A71" w:themeColor="accent1" w:themeShade="95"/>
@@ -13023,12 +12249,6 @@
         <w:insideH w:val="single" w:sz="4" w:space="0" w:color="2A4A71" w:themeColor="accent1" w:themeShade="95"/>
         <w:insideV w:val="single" w:sz="4" w:space="0" w:color="2A4A71" w:themeColor="accent1" w:themeShade="95"/>
       </w:tblBorders>
-      <w:tblCellMar>
-        <w:top w:w="0" w:type="dxa"/>
-        <w:left w:w="108" w:type="dxa"/>
-        <w:bottom w:w="0" w:type="dxa"/>
-        <w:right w:w="108" w:type="dxa"/>
-      </w:tblCellMar>
     </w:tblPr>
     <w:tblStylePr w:type="firstRow">
       <w:rPr>
@@ -13126,7 +12346,6 @@
     <w:tblPr>
       <w:tblStyleRowBandSize w:val="1"/>
       <w:tblStyleColBandSize w:val="1"/>
-      <w:tblInd w:w="0" w:type="dxa"/>
       <w:tblBorders>
         <w:top w:val="single" w:sz="4" w:space="0" w:color="732A29" w:themeColor="accent2" w:themeShade="95"/>
         <w:left w:val="single" w:sz="4" w:space="0" w:color="732A29" w:themeColor="accent2" w:themeShade="95"/>
@@ -13135,12 +12354,6 @@
         <w:insideH w:val="single" w:sz="4" w:space="0" w:color="732A29" w:themeColor="accent2" w:themeShade="95"/>
         <w:insideV w:val="single" w:sz="4" w:space="0" w:color="732A29" w:themeColor="accent2" w:themeShade="95"/>
       </w:tblBorders>
-      <w:tblCellMar>
-        <w:top w:w="0" w:type="dxa"/>
-        <w:left w:w="108" w:type="dxa"/>
-        <w:bottom w:w="0" w:type="dxa"/>
-        <w:right w:w="108" w:type="dxa"/>
-      </w:tblCellMar>
     </w:tblPr>
     <w:tblStylePr w:type="firstRow">
       <w:rPr>
@@ -13238,7 +12451,6 @@
     <w:tblPr>
       <w:tblStyleRowBandSize w:val="1"/>
       <w:tblStyleColBandSize w:val="1"/>
-      <w:tblInd w:w="0" w:type="dxa"/>
       <w:tblBorders>
         <w:top w:val="single" w:sz="4" w:space="0" w:color="5B722E" w:themeColor="accent3" w:themeShade="95"/>
         <w:left w:val="single" w:sz="4" w:space="0" w:color="5B722E" w:themeColor="accent3" w:themeShade="95"/>
@@ -13247,12 +12459,6 @@
         <w:insideH w:val="single" w:sz="4" w:space="0" w:color="5B722E" w:themeColor="accent3" w:themeShade="95"/>
         <w:insideV w:val="single" w:sz="4" w:space="0" w:color="5B722E" w:themeColor="accent3" w:themeShade="95"/>
       </w:tblBorders>
-      <w:tblCellMar>
-        <w:top w:w="0" w:type="dxa"/>
-        <w:left w:w="108" w:type="dxa"/>
-        <w:bottom w:w="0" w:type="dxa"/>
-        <w:right w:w="108" w:type="dxa"/>
-      </w:tblCellMar>
     </w:tblPr>
     <w:tblStylePr w:type="firstRow">
       <w:rPr>
@@ -13350,7 +12556,6 @@
     <w:tblPr>
       <w:tblStyleRowBandSize w:val="1"/>
       <w:tblStyleColBandSize w:val="1"/>
-      <w:tblInd w:w="0" w:type="dxa"/>
       <w:tblBorders>
         <w:top w:val="single" w:sz="4" w:space="0" w:color="4A395F" w:themeColor="accent4" w:themeShade="95"/>
         <w:left w:val="single" w:sz="4" w:space="0" w:color="4A395F" w:themeColor="accent4" w:themeShade="95"/>
@@ -13359,12 +12564,6 @@
         <w:insideH w:val="single" w:sz="4" w:space="0" w:color="4A395F" w:themeColor="accent4" w:themeShade="95"/>
         <w:insideV w:val="single" w:sz="4" w:space="0" w:color="4A395F" w:themeColor="accent4" w:themeShade="95"/>
       </w:tblBorders>
-      <w:tblCellMar>
-        <w:top w:w="0" w:type="dxa"/>
-        <w:left w:w="108" w:type="dxa"/>
-        <w:bottom w:w="0" w:type="dxa"/>
-        <w:right w:w="108" w:type="dxa"/>
-      </w:tblCellMar>
     </w:tblPr>
     <w:tblStylePr w:type="firstRow">
       <w:rPr>
@@ -13462,7 +12661,6 @@
     <w:tblPr>
       <w:tblStyleRowBandSize w:val="1"/>
       <w:tblStyleColBandSize w:val="1"/>
-      <w:tblInd w:w="0" w:type="dxa"/>
       <w:tblBorders>
         <w:top w:val="single" w:sz="4" w:space="0" w:color="266779" w:themeColor="accent5" w:themeShade="95"/>
         <w:left w:val="single" w:sz="4" w:space="0" w:color="266779" w:themeColor="accent5" w:themeShade="95"/>
@@ -13471,12 +12669,6 @@
         <w:insideH w:val="single" w:sz="4" w:space="0" w:color="266779" w:themeColor="accent5" w:themeShade="95"/>
         <w:insideV w:val="single" w:sz="4" w:space="0" w:color="266779" w:themeColor="accent5" w:themeShade="95"/>
       </w:tblBorders>
-      <w:tblCellMar>
-        <w:top w:w="0" w:type="dxa"/>
-        <w:left w:w="108" w:type="dxa"/>
-        <w:bottom w:w="0" w:type="dxa"/>
-        <w:right w:w="108" w:type="dxa"/>
-      </w:tblCellMar>
     </w:tblPr>
     <w:tblStylePr w:type="firstRow">
       <w:rPr>
@@ -13574,7 +12766,6 @@
     <w:tblPr>
       <w:tblStyleRowBandSize w:val="1"/>
       <w:tblStyleColBandSize w:val="1"/>
-      <w:tblInd w:w="0" w:type="dxa"/>
       <w:tblBorders>
         <w:top w:val="single" w:sz="4" w:space="0" w:color="B15407" w:themeColor="accent6" w:themeShade="95"/>
         <w:left w:val="single" w:sz="4" w:space="0" w:color="B15407" w:themeColor="accent6" w:themeShade="95"/>
@@ -13583,12 +12774,6 @@
         <w:insideH w:val="single" w:sz="4" w:space="0" w:color="B15407" w:themeColor="accent6" w:themeShade="95"/>
         <w:insideV w:val="single" w:sz="4" w:space="0" w:color="B15407" w:themeColor="accent6" w:themeShade="95"/>
       </w:tblBorders>
-      <w:tblCellMar>
-        <w:top w:w="0" w:type="dxa"/>
-        <w:left w:w="108" w:type="dxa"/>
-        <w:bottom w:w="0" w:type="dxa"/>
-        <w:right w:w="108" w:type="dxa"/>
-      </w:tblCellMar>
     </w:tblPr>
     <w:tblStylePr w:type="firstRow">
       <w:rPr>
@@ -13681,7 +12866,6 @@
     <w:tblPr>
       <w:tblStyleRowBandSize w:val="1"/>
       <w:tblStyleColBandSize w:val="1"/>
-      <w:tblInd w:w="0" w:type="dxa"/>
       <w:tblBorders>
         <w:top w:val="single" w:sz="4" w:space="0" w:color="D9D9D9" w:themeColor="text1" w:themeTint="26"/>
         <w:left w:val="single" w:sz="4" w:space="0" w:color="D9D9D9" w:themeColor="text1" w:themeTint="26"/>
@@ -13690,12 +12874,6 @@
         <w:insideH w:val="single" w:sz="4" w:space="0" w:color="D9D9D9" w:themeColor="text1" w:themeTint="26"/>
         <w:insideV w:val="single" w:sz="4" w:space="0" w:color="D9D9D9" w:themeColor="text1" w:themeTint="26"/>
       </w:tblBorders>
-      <w:tblCellMar>
-        <w:top w:w="0" w:type="dxa"/>
-        <w:left w:w="108" w:type="dxa"/>
-        <w:bottom w:w="0" w:type="dxa"/>
-        <w:right w:w="108" w:type="dxa"/>
-      </w:tblCellMar>
     </w:tblPr>
     <w:tblStylePr w:type="firstRow">
       <w:rPr>
@@ -13770,7 +12948,6 @@
     <w:tblPr>
       <w:tblStyleRowBandSize w:val="1"/>
       <w:tblStyleColBandSize w:val="1"/>
-      <w:tblInd w:w="0" w:type="dxa"/>
       <w:tblBorders>
         <w:top w:val="single" w:sz="4" w:space="0" w:color="B7CBE4" w:themeColor="accent1" w:themeTint="67"/>
         <w:left w:val="single" w:sz="4" w:space="0" w:color="B7CBE4" w:themeColor="accent1" w:themeTint="67"/>
@@ -13779,12 +12956,6 @@
         <w:insideH w:val="single" w:sz="4" w:space="0" w:color="B7CBE4" w:themeColor="accent1" w:themeTint="67"/>
         <w:insideV w:val="single" w:sz="4" w:space="0" w:color="B7CBE4" w:themeColor="accent1" w:themeTint="67"/>
       </w:tblBorders>
-      <w:tblCellMar>
-        <w:top w:w="0" w:type="dxa"/>
-        <w:left w:w="108" w:type="dxa"/>
-        <w:bottom w:w="0" w:type="dxa"/>
-        <w:right w:w="108" w:type="dxa"/>
-      </w:tblCellMar>
     </w:tblPr>
     <w:tblStylePr w:type="firstRow">
       <w:rPr>
@@ -13859,7 +13030,6 @@
     <w:tblPr>
       <w:tblStyleRowBandSize w:val="1"/>
       <w:tblStyleColBandSize w:val="1"/>
-      <w:tblInd w:w="0" w:type="dxa"/>
       <w:tblBorders>
         <w:top w:val="single" w:sz="4" w:space="0" w:color="E5B7B6" w:themeColor="accent2" w:themeTint="67"/>
         <w:left w:val="single" w:sz="4" w:space="0" w:color="E5B7B6" w:themeColor="accent2" w:themeTint="67"/>
@@ -13868,12 +13038,6 @@
         <w:insideH w:val="single" w:sz="4" w:space="0" w:color="E5B7B6" w:themeColor="accent2" w:themeTint="67"/>
         <w:insideV w:val="single" w:sz="4" w:space="0" w:color="E5B7B6" w:themeColor="accent2" w:themeTint="67"/>
       </w:tblBorders>
-      <w:tblCellMar>
-        <w:top w:w="0" w:type="dxa"/>
-        <w:left w:w="108" w:type="dxa"/>
-        <w:bottom w:w="0" w:type="dxa"/>
-        <w:right w:w="108" w:type="dxa"/>
-      </w:tblCellMar>
     </w:tblPr>
     <w:tblStylePr w:type="firstRow">
       <w:rPr>
@@ -13948,7 +13112,6 @@
     <w:tblPr>
       <w:tblStyleRowBandSize w:val="1"/>
       <w:tblStyleColBandSize w:val="1"/>
-      <w:tblInd w:w="0" w:type="dxa"/>
       <w:tblBorders>
         <w:top w:val="single" w:sz="4" w:space="0" w:color="D6E3BB" w:themeColor="accent3" w:themeTint="67"/>
         <w:left w:val="single" w:sz="4" w:space="0" w:color="D6E3BB" w:themeColor="accent3" w:themeTint="67"/>
@@ -13957,12 +13120,6 @@
         <w:insideH w:val="single" w:sz="4" w:space="0" w:color="D6E3BB" w:themeColor="accent3" w:themeTint="67"/>
         <w:insideV w:val="single" w:sz="4" w:space="0" w:color="D6E3BB" w:themeColor="accent3" w:themeTint="67"/>
       </w:tblBorders>
-      <w:tblCellMar>
-        <w:top w:w="0" w:type="dxa"/>
-        <w:left w:w="108" w:type="dxa"/>
-        <w:bottom w:w="0" w:type="dxa"/>
-        <w:right w:w="108" w:type="dxa"/>
-      </w:tblCellMar>
     </w:tblPr>
     <w:tblStylePr w:type="firstRow">
       <w:rPr>
@@ -14037,7 +13194,6 @@
     <w:tblPr>
       <w:tblStyleRowBandSize w:val="1"/>
       <w:tblStyleColBandSize w:val="1"/>
-      <w:tblInd w:w="0" w:type="dxa"/>
       <w:tblBorders>
         <w:top w:val="single" w:sz="4" w:space="0" w:color="CBC0D9" w:themeColor="accent4" w:themeTint="67"/>
         <w:left w:val="single" w:sz="4" w:space="0" w:color="CBC0D9" w:themeColor="accent4" w:themeTint="67"/>
@@ -14046,12 +13202,6 @@
         <w:insideH w:val="single" w:sz="4" w:space="0" w:color="CBC0D9" w:themeColor="accent4" w:themeTint="67"/>
         <w:insideV w:val="single" w:sz="4" w:space="0" w:color="CBC0D9" w:themeColor="accent4" w:themeTint="67"/>
       </w:tblBorders>
-      <w:tblCellMar>
-        <w:top w:w="0" w:type="dxa"/>
-        <w:left w:w="108" w:type="dxa"/>
-        <w:bottom w:w="0" w:type="dxa"/>
-        <w:right w:w="108" w:type="dxa"/>
-      </w:tblCellMar>
     </w:tblPr>
     <w:tblStylePr w:type="firstRow">
       <w:rPr>
@@ -14126,7 +13276,6 @@
     <w:tblPr>
       <w:tblStyleRowBandSize w:val="1"/>
       <w:tblStyleColBandSize w:val="1"/>
-      <w:tblInd w:w="0" w:type="dxa"/>
       <w:tblBorders>
         <w:top w:val="single" w:sz="4" w:space="0" w:color="B6DDE8" w:themeColor="accent5" w:themeTint="67"/>
         <w:left w:val="single" w:sz="4" w:space="0" w:color="B6DDE8" w:themeColor="accent5" w:themeTint="67"/>
@@ -14135,12 +13284,6 @@
         <w:insideH w:val="single" w:sz="4" w:space="0" w:color="B6DDE8" w:themeColor="accent5" w:themeTint="67"/>
         <w:insideV w:val="single" w:sz="4" w:space="0" w:color="B6DDE8" w:themeColor="accent5" w:themeTint="67"/>
       </w:tblBorders>
-      <w:tblCellMar>
-        <w:top w:w="0" w:type="dxa"/>
-        <w:left w:w="108" w:type="dxa"/>
-        <w:bottom w:w="0" w:type="dxa"/>
-        <w:right w:w="108" w:type="dxa"/>
-      </w:tblCellMar>
     </w:tblPr>
     <w:tblStylePr w:type="firstRow">
       <w:rPr>
@@ -14215,7 +13358,6 @@
     <w:tblPr>
       <w:tblStyleRowBandSize w:val="1"/>
       <w:tblStyleColBandSize w:val="1"/>
-      <w:tblInd w:w="0" w:type="dxa"/>
       <w:tblBorders>
         <w:top w:val="single" w:sz="4" w:space="0" w:color="FBD4B4" w:themeColor="accent6" w:themeTint="67"/>
         <w:left w:val="single" w:sz="4" w:space="0" w:color="FBD4B4" w:themeColor="accent6" w:themeTint="67"/>
@@ -14224,12 +13366,6 @@
         <w:insideH w:val="single" w:sz="4" w:space="0" w:color="FBD4B4" w:themeColor="accent6" w:themeTint="67"/>
         <w:insideV w:val="single" w:sz="4" w:space="0" w:color="FBD4B4" w:themeColor="accent6" w:themeTint="67"/>
       </w:tblBorders>
-      <w:tblCellMar>
-        <w:top w:w="0" w:type="dxa"/>
-        <w:left w:w="108" w:type="dxa"/>
-        <w:bottom w:w="0" w:type="dxa"/>
-        <w:right w:w="108" w:type="dxa"/>
-      </w:tblCellMar>
     </w:tblPr>
     <w:tblStylePr w:type="firstRow">
       <w:rPr>

</xml_diff>